<commit_message>
actualizacion de capitulos 1234 e informe
</commit_message>
<xml_diff>
--- a/Capitulos de Tesis/Capitulo 3..docx
+++ b/Capitulos de Tesis/Capitulo 3..docx
@@ -281,7 +281,7 @@
               </wp:anchor>
             </w:drawing>
           </mc:Choice>
-          <mc:Fallback xmlns:w16sdtfl="http://schemas.microsoft.com/office/word/2024/wordml/sdtformatlock" xmlns:w16du="http://schemas.microsoft.com/office/word/2023/wordml/word16du">
+          <mc:Fallback xmlns:w16du="http://schemas.microsoft.com/office/word/2023/wordml/word16du" xmlns:w16sdtfl="http://schemas.microsoft.com/office/word/2024/wordml/sdtformatlock">
             <w:pict>
               <v:group w14:anchorId="5628F788" id="Grupo 4" o:spid="_x0000_s1026" style="position:absolute;margin-left:-12.85pt;margin-top:10.35pt;width:430.25pt;height:121.6pt;z-index:251659264" coordorigin="2268,6021" coordsize="8280,2340" o:gfxdata="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">
                 <v:shapetype id="_x0000_t75" coordsize="21600,21600" o:spt="75" o:preferrelative="t" path="m@4@5l@4@11@9@11@9@5xe" filled="f" stroked="f">
@@ -443,8 +443,24 @@
           <w:sz w:val="24"/>
           <w:szCs w:val="24"/>
         </w:rPr>
-      </w:pPr>
-      <w:r>
+        <w:sectPr>
+          <w:headerReference w:type="even" r:id="rId10"/>
+          <w:headerReference w:type="default" r:id="rId11"/>
+          <w:footerReference w:type="even" r:id="rId12"/>
+          <w:footerReference w:type="default" r:id="rId13"/>
+          <w:headerReference w:type="first" r:id="rId14"/>
+          <w:footerReference w:type="first" r:id="rId15"/>
+          <w:pgSz w:w="12240" w:h="15840"/>
+          <w:pgMar w:top="1701" w:right="1701" w:bottom="1701" w:left="2268" w:header="709" w:footer="709" w:gutter="0"/>
+          <w:cols w:space="708"/>
+          <w:docGrid w:linePitch="360"/>
+        </w:sectPr>
+      </w:pPr>
+    </w:p>
+    <w:p>
+      <w:pPr>
+        <w:spacing w:line="480" w:lineRule="auto"/>
+        <w:jc w:val="center"/>
         <w:rPr>
           <w:rFonts w:ascii="Arial" w:hAnsi="Arial" w:cs="Arial"/>
           <w:b/>
@@ -452,14 +468,8 @@
           <w:sz w:val="24"/>
           <w:szCs w:val="24"/>
         </w:rPr>
-        <w:lastRenderedPageBreak/>
-        <w:t>CAPITULO III</w:t>
-      </w:r>
-    </w:p>
-    <w:p>
-      <w:pPr>
-        <w:spacing w:line="480" w:lineRule="auto"/>
-        <w:jc w:val="center"/>
+      </w:pPr>
+      <w:r>
         <w:rPr>
           <w:rFonts w:ascii="Arial" w:hAnsi="Arial" w:cs="Arial"/>
           <w:b/>
@@ -467,8 +477,14 @@
           <w:sz w:val="24"/>
           <w:szCs w:val="24"/>
         </w:rPr>
-      </w:pPr>
-      <w:r>
+        <w:lastRenderedPageBreak/>
+        <w:t>CAPITULO III</w:t>
+      </w:r>
+    </w:p>
+    <w:p>
+      <w:pPr>
+        <w:spacing w:line="480" w:lineRule="auto"/>
+        <w:jc w:val="center"/>
         <w:rPr>
           <w:rFonts w:ascii="Arial" w:hAnsi="Arial" w:cs="Arial"/>
           <w:b/>
@@ -476,18 +492,6 @@
           <w:sz w:val="24"/>
           <w:szCs w:val="24"/>
         </w:rPr>
-        <w:t>MARCO METODOLÓGICO</w:t>
-      </w:r>
-    </w:p>
-    <w:p>
-      <w:pPr>
-        <w:spacing w:line="480" w:lineRule="auto"/>
-        <w:jc w:val="both"/>
-        <w:rPr>
-          <w:rFonts w:ascii="Arial" w:hAnsi="Arial" w:cs="Arial"/>
-          <w:sz w:val="24"/>
-          <w:szCs w:val="24"/>
-        </w:rPr>
       </w:pPr>
       <w:r>
         <w:rPr>
@@ -497,44 +501,20 @@
           <w:sz w:val="24"/>
           <w:szCs w:val="24"/>
         </w:rPr>
-        <w:t xml:space="preserve">     </w:t>
-      </w:r>
-      <w:r>
+        <w:t>MARCO METODOLÓGICO</w:t>
+      </w:r>
+    </w:p>
+    <w:p>
+      <w:pPr>
+        <w:spacing w:line="480" w:lineRule="auto"/>
+        <w:jc w:val="both"/>
         <w:rPr>
           <w:rFonts w:ascii="Arial" w:hAnsi="Arial" w:cs="Arial"/>
           <w:sz w:val="24"/>
           <w:szCs w:val="24"/>
         </w:rPr>
-        <w:t xml:space="preserve"> A continuación, en el presente capítulo detallaremos las bases metodológicas con las cuales logramos desarrollar la investigación actual, desde el tipo y diseño de investigación, la población</w:t>
-      </w:r>
-      <w:r>
-        <w:rPr>
-          <w:rFonts w:ascii="Arial" w:hAnsi="Arial" w:cs="Arial"/>
-          <w:sz w:val="24"/>
-          <w:szCs w:val="24"/>
-        </w:rPr>
-        <w:t>,</w:t>
-      </w:r>
-      <w:r>
-        <w:rPr>
-          <w:rFonts w:ascii="Arial" w:hAnsi="Arial" w:cs="Arial"/>
-          <w:sz w:val="24"/>
-          <w:szCs w:val="24"/>
-        </w:rPr>
-        <w:t xml:space="preserve"> la metodología del autor seleccionado</w:t>
-      </w:r>
-      <w:r>
-        <w:rPr>
-          <w:rFonts w:ascii="Arial" w:hAnsi="Arial" w:cs="Arial"/>
-          <w:sz w:val="24"/>
-          <w:szCs w:val="24"/>
-        </w:rPr>
-        <w:t>, hasta llegar al cuadro y cronograma de actividades.</w:t>
-      </w:r>
-    </w:p>
-    <w:p>
-      <w:pPr>
-        <w:spacing w:line="480" w:lineRule="auto"/>
+      </w:pPr>
+      <w:r>
         <w:rPr>
           <w:rFonts w:ascii="Arial" w:hAnsi="Arial" w:cs="Arial"/>
           <w:b/>
@@ -542,8 +522,44 @@
           <w:sz w:val="24"/>
           <w:szCs w:val="24"/>
         </w:rPr>
-      </w:pPr>
-      <w:r>
+        <w:t xml:space="preserve">     </w:t>
+      </w:r>
+      <w:r>
+        <w:rPr>
+          <w:rFonts w:ascii="Arial" w:hAnsi="Arial" w:cs="Arial"/>
+          <w:sz w:val="24"/>
+          <w:szCs w:val="24"/>
+        </w:rPr>
+        <w:t xml:space="preserve"> A continuación, en el presente capítulo detallaremos las bases metodológicas con las cuales logramos desarrollar la investigación actual, desde el tipo y diseño de investigación, la población</w:t>
+      </w:r>
+      <w:r>
+        <w:rPr>
+          <w:rFonts w:ascii="Arial" w:hAnsi="Arial" w:cs="Arial"/>
+          <w:sz w:val="24"/>
+          <w:szCs w:val="24"/>
+        </w:rPr>
+        <w:t>,</w:t>
+      </w:r>
+      <w:r>
+        <w:rPr>
+          <w:rFonts w:ascii="Arial" w:hAnsi="Arial" w:cs="Arial"/>
+          <w:sz w:val="24"/>
+          <w:szCs w:val="24"/>
+        </w:rPr>
+        <w:t xml:space="preserve"> la metodología del autor seleccionado</w:t>
+      </w:r>
+      <w:r>
+        <w:rPr>
+          <w:rFonts w:ascii="Arial" w:hAnsi="Arial" w:cs="Arial"/>
+          <w:sz w:val="24"/>
+          <w:szCs w:val="24"/>
+        </w:rPr>
+        <w:t>, hasta llegar al cuadro y cronograma de actividades.</w:t>
+      </w:r>
+    </w:p>
+    <w:p>
+      <w:pPr>
+        <w:spacing w:line="480" w:lineRule="auto"/>
         <w:rPr>
           <w:rFonts w:ascii="Arial" w:hAnsi="Arial" w:cs="Arial"/>
           <w:b/>
@@ -551,8 +567,7 @@
           <w:sz w:val="24"/>
           <w:szCs w:val="24"/>
         </w:rPr>
-        <w:t>1. TI</w:t>
-      </w:r>
+      </w:pPr>
       <w:r>
         <w:rPr>
           <w:rFonts w:ascii="Arial" w:hAnsi="Arial" w:cs="Arial"/>
@@ -561,7 +576,7 @@
           <w:sz w:val="24"/>
           <w:szCs w:val="24"/>
         </w:rPr>
-        <w:t>P</w:t>
+        <w:t>1. TI</w:t>
       </w:r>
       <w:r>
         <w:rPr>
@@ -571,7 +586,7 @@
           <w:sz w:val="24"/>
           <w:szCs w:val="24"/>
         </w:rPr>
-        <w:t>O Y DISEÑO DE LA INVESTIGACI</w:t>
+        <w:t>P</w:t>
       </w:r>
       <w:r>
         <w:rPr>
@@ -581,7 +596,7 @@
           <w:sz w:val="24"/>
           <w:szCs w:val="24"/>
         </w:rPr>
-        <w:t>O</w:t>
+        <w:t>O Y DISEÑO DE LA INVESTIGACI</w:t>
       </w:r>
       <w:r>
         <w:rPr>
@@ -591,231 +606,9 @@
           <w:sz w:val="24"/>
           <w:szCs w:val="24"/>
         </w:rPr>
-        <w:t>N</w:t>
-      </w:r>
-    </w:p>
-    <w:p>
-      <w:pPr>
-        <w:pStyle w:val="Prrafodelista"/>
-        <w:spacing w:line="480" w:lineRule="auto"/>
-        <w:rPr>
-          <w:rFonts w:ascii="Arial" w:hAnsi="Arial" w:cs="Arial"/>
-        </w:rPr>
-      </w:pPr>
-      <w:r>
-        <w:rPr>
-          <w:rFonts w:ascii="Arial" w:hAnsi="Arial" w:cs="Arial"/>
-        </w:rPr>
-        <w:t>Según Hernández, Fernández y Baptista (2014)</w:t>
-      </w:r>
-      <w:r>
-        <w:rPr>
-          <w:rFonts w:ascii="Arial" w:hAnsi="Arial" w:cs="Arial"/>
-        </w:rPr>
-        <w:t>,</w:t>
-      </w:r>
-    </w:p>
-    <w:p>
-      <w:pPr>
-        <w:pStyle w:val="Prrafodelista"/>
-        <w:spacing w:line="360" w:lineRule="auto"/>
-        <w:jc w:val="both"/>
-        <w:rPr>
-          <w:rFonts w:ascii="Arial" w:hAnsi="Arial" w:cs="Arial"/>
-        </w:rPr>
-      </w:pPr>
-      <w:r>
-        <w:rPr>
-          <w:rFonts w:ascii="Arial" w:hAnsi="Arial" w:cs="Arial"/>
-        </w:rPr>
-        <w:t>“</w:t>
-      </w:r>
-      <w:r>
-        <w:rPr>
-          <w:rFonts w:ascii="Arial" w:hAnsi="Arial" w:cs="Arial"/>
-        </w:rPr>
-        <w:t xml:space="preserve">Los estudios descriptivos </w:t>
-      </w:r>
-      <w:r>
-        <w:rPr>
-          <w:rFonts w:ascii="Arial" w:hAnsi="Arial" w:cs="Arial"/>
-        </w:rPr>
-        <w:t>busca</w:t>
-      </w:r>
-      <w:r>
-        <w:rPr>
-          <w:rFonts w:ascii="Arial" w:hAnsi="Arial" w:cs="Arial"/>
-        </w:rPr>
-        <w:t>n</w:t>
-      </w:r>
-      <w:r>
-        <w:rPr>
-          <w:rFonts w:ascii="Arial" w:hAnsi="Arial" w:cs="Arial"/>
-        </w:rPr>
-        <w:t xml:space="preserve"> especificar las propiedades, las características y los perfiles de personas, grupos, comunidades, procesos, objetos o cualquier otro fenómeno que se someta a un análisis. Es decir, únicamente pretenden medir o recoger información de manera independiente o conjunta sobre los conceptos o las variables a las que se refieren</w:t>
-      </w:r>
-      <w:r>
-        <w:rPr>
-          <w:rFonts w:ascii="Arial" w:hAnsi="Arial" w:cs="Arial"/>
-        </w:rPr>
-        <w:t>.”</w:t>
-      </w:r>
-    </w:p>
-    <w:p>
-      <w:pPr>
-        <w:spacing w:line="360" w:lineRule="auto"/>
-        <w:jc w:val="both"/>
-        <w:rPr>
-          <w:rFonts w:ascii="Arial" w:hAnsi="Arial" w:cs="Arial"/>
-        </w:rPr>
-      </w:pPr>
-    </w:p>
-    <w:p>
-      <w:pPr>
-        <w:pStyle w:val="Tesis"/>
-      </w:pPr>
-      <w:r>
-        <w:t xml:space="preserve">Adicionalmente, se tiene la definición de </w:t>
-      </w:r>
-      <w:r>
-        <w:t>Ander-</w:t>
-      </w:r>
-      <w:proofErr w:type="spellStart"/>
-      <w:r>
-        <w:t>Egg</w:t>
-      </w:r>
-      <w:proofErr w:type="spellEnd"/>
-      <w:r>
-        <w:t xml:space="preserve"> (1995), “La investigación descriptiva consiste en la caracterización de un hecho, fenómeno o suceso con el fin de establecer su estructura o comportamiento. Los estudios descriptivos se contentan con señalar las manifestaciones o atributos del objeto estudiado, sin preocuparse por buscar sus causas”</w:t>
-      </w:r>
-      <w:r>
-        <w:t>.</w:t>
-      </w:r>
-      <w:r>
-        <w:t xml:space="preserve"> Se puede concluir por los autores</w:t>
-      </w:r>
-      <w:r>
-        <w:t xml:space="preserve"> mencionados que la presente investigación se puede clarificar como una investigación descriptiva, ya que esta implica la </w:t>
-      </w:r>
-      <w:r>
-        <w:lastRenderedPageBreak/>
-        <w:t>recolección de datos con el propósito de proporcionar una representación precisa y concreta de la situación actual de los estudiantes de bachillerato en Venezuela.</w:t>
-      </w:r>
-    </w:p>
-    <w:p>
-      <w:pPr>
-        <w:pStyle w:val="Tesis"/>
-      </w:pPr>
-      <w:r>
-        <w:t xml:space="preserve">A </w:t>
-      </w:r>
-      <w:r>
-        <w:t xml:space="preserve">propósito de profundizar en el tipo de investigación, el autor </w:t>
-      </w:r>
-      <w:r>
-        <w:t>hurtado (2012) define la investigación proyectiva como “Este tipo de investigación propone soluciones a una situación determinada a partir de un proceso de indagación. Implica explorar, describir, explicar y proponer alternativas de cambio”. Igualmente, Arias (2012) explica que “La investigación proyectiva es un diseño de campo que tiene como fin proponer soluciones a una situación problemática detectada en una realidad especifica. Se orienta hacia la formulación de planes, programas o modelos que respondan a necesidades sentidas en un grupo social, institución o comunidad. Incluye fases de diagnóstico, diseño, fundamentación y, en algunos casos, la ejecución parcial de la propuesta para validar su factibilidad”.</w:t>
-      </w:r>
-      <w:r>
-        <w:t xml:space="preserve"> </w:t>
-      </w:r>
-    </w:p>
-    <w:p>
-      <w:pPr>
-        <w:pStyle w:val="Tesis"/>
-      </w:pPr>
-      <w:r>
-        <w:t>En función de lo planteado por los autores, se puede clasificar la presente investigación de tipo descriptiva-proyectiva debido a que esta implica</w:t>
-      </w:r>
-      <w:r>
-        <w:t xml:space="preserve"> la recopilación de datos e información precisa con el objetivo de proporcionar una representación precisa y concreta de la situación actual de los estudiantes de bachillerato en Venezuela y el uso de esa información para proponer una solución a la situación.</w:t>
-      </w:r>
-    </w:p>
-    <w:p>
-      <w:pPr>
-        <w:pStyle w:val="Tesis"/>
-      </w:pPr>
-      <w:r>
-        <w:lastRenderedPageBreak/>
-        <w:t>En segundo lugar</w:t>
-      </w:r>
-      <w:r>
-        <w:t xml:space="preserve">, </w:t>
-      </w:r>
-      <w:r>
-        <w:t>sobre el diseño de investigación</w:t>
-      </w:r>
-      <w:r>
-        <w:t xml:space="preserve">, Hernández, Fernández y Baptista (2014) explican que “La investigación de campo es aquella que se realiza en el entorno natural donde ocurren los fenómenos que se estudian, recogiendo datos directamente de la realidad para analizarlos posteriormente. El investigador observa, registra y analiza los fenómenos sin manipular las variables”. </w:t>
-      </w:r>
-    </w:p>
-    <w:p>
-      <w:pPr>
-        <w:pStyle w:val="Tesis"/>
-      </w:pPr>
-      <w:r>
-        <w:t>Adicionalmente, Ander-</w:t>
-      </w:r>
-      <w:proofErr w:type="spellStart"/>
-      <w:r>
-        <w:t>egg</w:t>
-      </w:r>
-      <w:proofErr w:type="spellEnd"/>
-      <w:r>
-        <w:t xml:space="preserve"> (1995) sostiene que una investigación de campo </w:t>
-      </w:r>
-      <w:r>
-        <w:t>consiste en la recolección de datos directamente de los sujetos investigados, o de la realidad donde ocurren los hechos (datos primarios), sin manipular o controlar variable alguna. Es el estudio sistemático de problemas en la realidad, con el propósito de describirlos, interpretarlos, entender su naturaleza y factores constituyentes, explicar sus causas y efectos, o predecir su ocurrencia.</w:t>
-      </w:r>
-      <w:r>
-        <w:t xml:space="preserve"> Por ende, se puede decir que esta investigación tiene un diseño de campo ya que se utilizan herramientas de recolección de datos en los sujetos que son objeto de estudio sin manipular variables o elementos de la realidad.</w:t>
-      </w:r>
-    </w:p>
-    <w:p>
-      <w:pPr>
-        <w:pStyle w:val="Tesis"/>
-      </w:pPr>
-      <w:r>
-        <w:t xml:space="preserve">Quispe (2019) </w:t>
-      </w:r>
-      <w:r>
-        <w:t>menciona que</w:t>
-      </w:r>
-      <w:r>
-        <w:t xml:space="preserve"> la investigación no experimental </w:t>
-      </w:r>
-      <w:r>
-        <w:t>es un tipo de estudio en el que no se manipulan variables independientes porque ya ocurrieron, porque no es posible o porque no es ético hacerlo. Se basa en la observación y medición de variables en su ambiente natural para establecer relaciones entre ellas, sin intervención activa del investigador</w:t>
-      </w:r>
-      <w:r>
-        <w:t>.</w:t>
-      </w:r>
-    </w:p>
-    <w:p>
-      <w:pPr>
-        <w:pStyle w:val="Tesis"/>
-        <w:rPr>
-          <w:sz w:val="28"/>
-          <w:szCs w:val="28"/>
-        </w:rPr>
-      </w:pPr>
-      <w:r>
-        <w:lastRenderedPageBreak/>
-        <w:t xml:space="preserve">A su vez, Icart (2001) afirma que la investigación no experimental </w:t>
-      </w:r>
-      <w:r>
-        <w:t>es aquella en la que el investigador se limita a medir o recoger información sobre las variables en su contexto natural, sin introducir cambios o alteraciones en el entorno. Su objetivo principal es describir, analizar e interpretar las características de un fenómeno en su estado actual.</w:t>
-      </w:r>
-      <w:r>
-        <w:t xml:space="preserve"> De acuerdo autores, se puede definir que la presente investigación tiene un diseño no experimental</w:t>
-      </w:r>
-      <w:r>
-        <w:t xml:space="preserve"> ya que solo recolecta y estudia las variables en su contexto natural, sin cambiar o manipular el entorno en el que se encuentran.</w:t>
-      </w:r>
-    </w:p>
-    <w:p>
-      <w:pPr>
-        <w:spacing w:line="480" w:lineRule="auto"/>
-        <w:jc w:val="both"/>
+        <w:t>O</w:t>
+      </w:r>
+      <w:r>
         <w:rPr>
           <w:rFonts w:ascii="Arial" w:hAnsi="Arial" w:cs="Arial"/>
           <w:b/>
@@ -823,8 +616,260 @@
           <w:sz w:val="24"/>
           <w:szCs w:val="24"/>
         </w:rPr>
-      </w:pPr>
-      <w:r>
+        <w:t>N</w:t>
+      </w:r>
+    </w:p>
+    <w:p>
+      <w:pPr>
+        <w:pStyle w:val="Prrafodelista"/>
+        <w:spacing w:line="480" w:lineRule="auto"/>
+        <w:rPr>
+          <w:rFonts w:ascii="Arial" w:hAnsi="Arial" w:cs="Arial"/>
+        </w:rPr>
+      </w:pPr>
+      <w:r>
+        <w:rPr>
+          <w:rFonts w:ascii="Arial" w:hAnsi="Arial" w:cs="Arial"/>
+        </w:rPr>
+        <w:t>Según Hernández, Fernández y Baptista (2014)</w:t>
+      </w:r>
+      <w:r>
+        <w:rPr>
+          <w:rFonts w:ascii="Arial" w:hAnsi="Arial" w:cs="Arial"/>
+        </w:rPr>
+        <w:t>,</w:t>
+      </w:r>
+    </w:p>
+    <w:p>
+      <w:pPr>
+        <w:pStyle w:val="Prrafodelista"/>
+        <w:spacing w:line="360" w:lineRule="auto"/>
+        <w:jc w:val="both"/>
+        <w:rPr>
+          <w:rFonts w:ascii="Arial" w:hAnsi="Arial" w:cs="Arial"/>
+        </w:rPr>
+      </w:pPr>
+      <w:r>
+        <w:rPr>
+          <w:rFonts w:ascii="Arial" w:hAnsi="Arial" w:cs="Arial"/>
+        </w:rPr>
+        <w:t>“</w:t>
+      </w:r>
+      <w:r>
+        <w:rPr>
+          <w:rFonts w:ascii="Arial" w:hAnsi="Arial" w:cs="Arial"/>
+        </w:rPr>
+        <w:t xml:space="preserve">Los estudios descriptivos </w:t>
+      </w:r>
+      <w:r>
+        <w:rPr>
+          <w:rFonts w:ascii="Arial" w:hAnsi="Arial" w:cs="Arial"/>
+        </w:rPr>
+        <w:t>busca</w:t>
+      </w:r>
+      <w:r>
+        <w:rPr>
+          <w:rFonts w:ascii="Arial" w:hAnsi="Arial" w:cs="Arial"/>
+        </w:rPr>
+        <w:t>n</w:t>
+      </w:r>
+      <w:r>
+        <w:rPr>
+          <w:rFonts w:ascii="Arial" w:hAnsi="Arial" w:cs="Arial"/>
+        </w:rPr>
+        <w:t xml:space="preserve"> especificar las propiedades, las características y los perfiles de personas, grupos, comunidades, procesos, objetos o cualquier otro fenómeno que se someta a un análisis. Es decir, únicamente pretenden medir o recoger información de manera independiente o conjunta sobre los conceptos o las variables a las que se refieren</w:t>
+      </w:r>
+      <w:r>
+        <w:rPr>
+          <w:rFonts w:ascii="Arial" w:hAnsi="Arial" w:cs="Arial"/>
+        </w:rPr>
+        <w:t>.”</w:t>
+      </w:r>
+    </w:p>
+    <w:p>
+      <w:pPr>
+        <w:spacing w:line="360" w:lineRule="auto"/>
+        <w:jc w:val="both"/>
+        <w:rPr>
+          <w:rFonts w:ascii="Arial" w:hAnsi="Arial" w:cs="Arial"/>
+        </w:rPr>
+      </w:pPr>
+    </w:p>
+    <w:p>
+      <w:pPr>
+        <w:pStyle w:val="Tesis"/>
+        <w:sectPr>
+          <w:footerReference w:type="default" r:id="rId16"/>
+          <w:pgSz w:w="12240" w:h="15840"/>
+          <w:pgMar w:top="1701" w:right="1701" w:bottom="1701" w:left="2268" w:header="709" w:footer="709" w:gutter="0"/>
+          <w:pgNumType w:start="74"/>
+          <w:cols w:space="708"/>
+          <w:docGrid w:linePitch="360"/>
+        </w:sectPr>
+      </w:pPr>
+      <w:r>
+        <w:t xml:space="preserve">Adicionalmente, se tiene la definición de </w:t>
+      </w:r>
+      <w:r>
+        <w:t>Ander-</w:t>
+      </w:r>
+      <w:proofErr w:type="spellStart"/>
+      <w:r>
+        <w:t>Egg</w:t>
+      </w:r>
+      <w:proofErr w:type="spellEnd"/>
+      <w:r>
+        <w:t xml:space="preserve"> (1995), “La investigación descriptiva consiste en la caracterización de un hecho, fenómeno o suceso con el fin de establecer su estructura o comportamiento. Los estudios descriptivos se contentan con señalar las manifestaciones o atributos del objeto estudiado, sin preocuparse por buscar sus causas”</w:t>
+      </w:r>
+      <w:r>
+        <w:t>.</w:t>
+      </w:r>
+      <w:r>
+        <w:t xml:space="preserve"> Se puede concluir por los autores</w:t>
+      </w:r>
+      <w:r>
+        <w:t xml:space="preserve"> mencionados que la presente investigación se puede clarificar como una investigación descriptiva, ya</w:t>
+      </w:r>
+      <w:r>
+        <w:t xml:space="preserve"> </w:t>
+      </w:r>
+      <w:r>
+        <w:t>que esta</w:t>
+      </w:r>
+      <w:r>
+        <w:t xml:space="preserve"> </w:t>
+      </w:r>
+      <w:r>
+        <w:t>implica la</w:t>
+      </w:r>
+      <w:r>
+        <w:t xml:space="preserve"> </w:t>
+      </w:r>
+    </w:p>
+    <w:p>
+      <w:pPr>
+        <w:pStyle w:val="Tesis"/>
+        <w:ind w:firstLine="0"/>
+      </w:pPr>
+      <w:r>
+        <w:lastRenderedPageBreak/>
+        <w:t>recolección de datos con el propósito de proporcionar una representación precisa y concreta de la situación actual de los estudiantes de bachillerato en Venezuela.</w:t>
+      </w:r>
+    </w:p>
+    <w:p>
+      <w:pPr>
+        <w:pStyle w:val="Tesis"/>
+      </w:pPr>
+      <w:r>
+        <w:t xml:space="preserve">A </w:t>
+      </w:r>
+      <w:r>
+        <w:t xml:space="preserve">propósito de profundizar en el tipo de investigación, el autor </w:t>
+      </w:r>
+      <w:r>
+        <w:t>hurtado (2012) define la investigación proyectiva como “Este tipo de investigación propone soluciones a una situación determinada a partir de un proceso de indagación. Implica explorar, describir, explicar y proponer alternativas de cambio”. Igualmente, Arias (2012) explica que “La investigación proyectiva es un diseño de campo que tiene como fin proponer soluciones a una situación problemática detectada en una realidad especifica. Se orienta hacia la formulación de planes, programas o modelos que respondan a necesidades sentidas en un grupo social, institución o comunidad. Incluye fases de diagnóstico, diseño, fundamentación y, en algunos casos, la ejecución parcial de la propuesta para validar su factibilidad”.</w:t>
+      </w:r>
+      <w:r>
+        <w:t xml:space="preserve"> </w:t>
+      </w:r>
+    </w:p>
+    <w:p>
+      <w:pPr>
+        <w:pStyle w:val="Tesis"/>
+      </w:pPr>
+      <w:r>
+        <w:t>En función de lo planteado por los autores, se puede clasificar la presente investigación de tipo descriptiva-proyectiva debido a que esta implica</w:t>
+      </w:r>
+      <w:r>
+        <w:t xml:space="preserve"> la recopilación de datos e información precisa con el objetivo de proporcionar una representación precisa y concreta de la situación actual de los estudiantes de bachillerato en Venezuela y el uso de esa información para proponer una solución a la situación.</w:t>
+      </w:r>
+    </w:p>
+    <w:p>
+      <w:pPr>
+        <w:pStyle w:val="Tesis"/>
+      </w:pPr>
+      <w:r>
+        <w:lastRenderedPageBreak/>
+        <w:t>En segundo lugar</w:t>
+      </w:r>
+      <w:r>
+        <w:t xml:space="preserve">, </w:t>
+      </w:r>
+      <w:r>
+        <w:t>sobre el diseño de investigación</w:t>
+      </w:r>
+      <w:r>
+        <w:t xml:space="preserve">, Hernández, Fernández y Baptista (2014) explican que “La investigación de campo es aquella que se realiza en el entorno natural donde ocurren los fenómenos que se estudian, recogiendo datos directamente de la realidad para analizarlos posteriormente. El investigador observa, registra y analiza los fenómenos sin manipular las variables”. </w:t>
+      </w:r>
+    </w:p>
+    <w:p>
+      <w:pPr>
+        <w:pStyle w:val="Tesis"/>
+      </w:pPr>
+      <w:r>
+        <w:t>Adicionalmente, Ander-</w:t>
+      </w:r>
+      <w:proofErr w:type="spellStart"/>
+      <w:r>
+        <w:t>egg</w:t>
+      </w:r>
+      <w:proofErr w:type="spellEnd"/>
+      <w:r>
+        <w:t xml:space="preserve"> (1995) sostiene que una investigación de campo </w:t>
+      </w:r>
+      <w:r>
+        <w:t>consiste en la recolección de datos directamente de los sujetos investigados, o de la realidad donde ocurren los hechos (datos primarios), sin manipular o controlar variable alguna. Es el estudio sistemático de problemas en la realidad, con el propósito de describirlos, interpretarlos, entender su naturaleza y factores constituyentes, explicar sus causas y efectos, o predecir su ocurrencia.</w:t>
+      </w:r>
+      <w:r>
+        <w:t xml:space="preserve"> Por ende, se puede decir que esta investigación tiene un diseño de campo ya que se utilizan herramientas de recolección de datos en los sujetos que son objeto de estudio sin manipular variables o elementos de la realidad.</w:t>
+      </w:r>
+    </w:p>
+    <w:p>
+      <w:pPr>
+        <w:pStyle w:val="Tesis"/>
+      </w:pPr>
+      <w:r>
+        <w:t xml:space="preserve">Quispe (2019) </w:t>
+      </w:r>
+      <w:r>
+        <w:t>menciona que</w:t>
+      </w:r>
+      <w:r>
+        <w:t xml:space="preserve"> la investigación no experimental </w:t>
+      </w:r>
+      <w:r>
+        <w:t>es un tipo de estudio en el que no se manipulan variables independientes porque ya ocurrieron, porque no es posible o porque no es ético hacerlo. Se basa en la observación y medición de variables en su ambiente natural para establecer relaciones entre ellas, sin intervención activa del investigador</w:t>
+      </w:r>
+      <w:r>
+        <w:t>.</w:t>
+      </w:r>
+    </w:p>
+    <w:p>
+      <w:pPr>
+        <w:pStyle w:val="Tesis"/>
+        <w:rPr>
+          <w:sz w:val="28"/>
+          <w:szCs w:val="28"/>
+        </w:rPr>
+      </w:pPr>
+      <w:r>
+        <w:lastRenderedPageBreak/>
+        <w:t xml:space="preserve">A su vez, Icart (2001) afirma que la investigación no experimental </w:t>
+      </w:r>
+      <w:r>
+        <w:t>es aquella en la que el investigador se limita a medir o recoger información sobre las variables en su contexto natural, sin introducir cambios o alteraciones en el entorno. Su objetivo principal es describir, analizar e interpretar las características de un fenómeno en su estado actual.</w:t>
+      </w:r>
+      <w:r>
+        <w:t xml:space="preserve"> De acuerdo autores, se puede definir que la presente investigación tiene un diseño no experimental</w:t>
+      </w:r>
+      <w:r>
+        <w:t xml:space="preserve"> ya que solo recolecta y estudia las variables en su contexto natural, sin cambiar o manipular el entorno en el que se encuentran.</w:t>
+      </w:r>
+    </w:p>
+    <w:p>
+      <w:pPr>
+        <w:spacing w:line="480" w:lineRule="auto"/>
+        <w:jc w:val="both"/>
         <w:rPr>
           <w:rFonts w:ascii="Arial" w:hAnsi="Arial" w:cs="Arial"/>
           <w:b/>
@@ -832,8 +877,7 @@
           <w:sz w:val="24"/>
           <w:szCs w:val="24"/>
         </w:rPr>
-        <w:t>2. POBLACI</w:t>
-      </w:r>
+      </w:pPr>
       <w:r>
         <w:rPr>
           <w:rFonts w:ascii="Arial" w:hAnsi="Arial" w:cs="Arial"/>
@@ -842,7 +886,7 @@
           <w:sz w:val="24"/>
           <w:szCs w:val="24"/>
         </w:rPr>
-        <w:t>O</w:t>
+        <w:t>2. POBLACI</w:t>
       </w:r>
       <w:r>
         <w:rPr>
@@ -852,7 +896,7 @@
           <w:sz w:val="24"/>
           <w:szCs w:val="24"/>
         </w:rPr>
-        <w:t>N</w:t>
+        <w:t>O</w:t>
       </w:r>
       <w:r>
         <w:rPr>
@@ -862,104 +906,9 @@
           <w:sz w:val="24"/>
           <w:szCs w:val="24"/>
         </w:rPr>
-        <w:t xml:space="preserve"> Y MUESTRA</w:t>
-      </w:r>
-    </w:p>
-    <w:p>
-      <w:pPr>
-        <w:pStyle w:val="Tesis"/>
-      </w:pPr>
-      <w:r>
-        <w:t>De acuerdo a Bernal (2010),</w:t>
-      </w:r>
-      <w:r>
-        <w:t xml:space="preserve"> Una población es un conjunto de elementos que presentan una característica común, la cual se estudia y da origen a los datos de la investigación. La población debe estar claramente definida en cuanto al conjunto de elementos que la conforman y en cuanto al tiempo y al espacio. De igual modo, Arias (2012) </w:t>
-      </w:r>
-      <w:r>
-        <w:t>declara que se entiende por población o universo al conjunto de unidades, personas, cosas, eventos o sucesos, que poseen características comunes y son objeto de estudio. La población debe ser delimitada con claridad y precisión en cuanto al tiempo y al espacio.</w:t>
-      </w:r>
-    </w:p>
-    <w:p>
-      <w:pPr>
-        <w:pStyle w:val="Tesis"/>
-      </w:pPr>
-      <w:r>
-        <w:t xml:space="preserve">En este sentido, se </w:t>
-      </w:r>
-      <w:r>
-        <w:t xml:space="preserve">entiende que la población es un conjunto de personas, objetos o elementos que </w:t>
-      </w:r>
-      <w:r>
-        <w:t>poseen características en común, ya sean demográficas, sociales o que se encuentren en un área geográfica</w:t>
-      </w:r>
-      <w:r>
-        <w:t xml:space="preserve"> </w:t>
-      </w:r>
-      <w:r>
-        <w:lastRenderedPageBreak/>
-        <w:t>determinada</w:t>
-      </w:r>
-      <w:r>
-        <w:t>. Con respecto a la muestra, Hernández, Fernández y Baptista (2014) sostienen que u</w:t>
-      </w:r>
-      <w:r>
-        <w:t>na muestra es un subgrupo de la población del cual se recolectan los datos y debe ser representativo de dicha población</w:t>
-      </w:r>
-      <w:r>
-        <w:t>.</w:t>
-      </w:r>
-      <w:r>
-        <w:t xml:space="preserve"> </w:t>
-      </w:r>
-      <w:r>
-        <w:t>D</w:t>
-      </w:r>
-      <w:r>
-        <w:t xml:space="preserve">e forma </w:t>
-      </w:r>
-      <w:r>
-        <w:t xml:space="preserve">similar, </w:t>
-      </w:r>
-      <w:r>
-        <w:t>Bisquerra (2004) describe a la muestra como</w:t>
-      </w:r>
-      <w:r>
-        <w:t xml:space="preserve"> un subconjunto de casos o individuos de una población estadística. Las muestras se obtienen con la intención de inferir propiedades de la totalidad de la población</w:t>
-      </w:r>
-      <w:r>
-        <w:t>.</w:t>
-      </w:r>
-    </w:p>
-    <w:p>
-      <w:pPr>
-        <w:pStyle w:val="Tesis"/>
-      </w:pPr>
-      <w:r>
-        <w:t>Gracias a las definiciones y descripciones de los autores anteriores, podemos deducir que una muestra es un conjunto seleccionado de sujetos u objetos pertenecientes a una población en particular, con el objetivo de conocer o estudiar las características o propiedades de la población en cuestión.</w:t>
-      </w:r>
-      <w:r>
-        <w:t xml:space="preserve"> Para la ejecución de esta investigación, la muestra seleccionada est</w:t>
-      </w:r>
-      <w:r>
-        <w:t>á</w:t>
-      </w:r>
-      <w:r>
-        <w:t xml:space="preserve"> conform</w:t>
-      </w:r>
-      <w:r>
-        <w:t>a</w:t>
-      </w:r>
-      <w:r>
-        <w:t>da por alumnos de</w:t>
-      </w:r>
-      <w:r>
-        <w:t>l Colegio Nuestra Sra. De Guadalupe.</w:t>
-      </w:r>
-    </w:p>
-    <w:p>
-      <w:pPr>
-        <w:spacing w:after="0" w:line="480" w:lineRule="auto"/>
-        <w:jc w:val="center"/>
+        <w:t>N</w:t>
+      </w:r>
+      <w:r>
         <w:rPr>
           <w:rFonts w:ascii="Arial" w:hAnsi="Arial" w:cs="Arial"/>
           <w:b/>
@@ -967,8 +916,104 @@
           <w:sz w:val="24"/>
           <w:szCs w:val="24"/>
         </w:rPr>
-      </w:pPr>
-      <w:r>
+        <w:t xml:space="preserve"> Y MUESTRA</w:t>
+      </w:r>
+    </w:p>
+    <w:p>
+      <w:pPr>
+        <w:pStyle w:val="Tesis"/>
+      </w:pPr>
+      <w:r>
+        <w:t>De acuerdo a Bernal (2010),</w:t>
+      </w:r>
+      <w:r>
+        <w:t xml:space="preserve"> Una población es un conjunto de elementos que presentan una característica común, la cual se estudia y da origen a los datos de la investigación. La población debe estar claramente definida en cuanto al conjunto de elementos que la conforman y en cuanto al tiempo y al espacio. De igual modo, Arias (2012) </w:t>
+      </w:r>
+      <w:r>
+        <w:t>declara que se entiende por población o universo al conjunto de unidades, personas, cosas, eventos o sucesos, que poseen características comunes y son objeto de estudio. La población debe ser delimitada con claridad y precisión en cuanto al tiempo y al espacio.</w:t>
+      </w:r>
+    </w:p>
+    <w:p>
+      <w:pPr>
+        <w:pStyle w:val="Tesis"/>
+      </w:pPr>
+      <w:r>
+        <w:t xml:space="preserve">En este sentido, se </w:t>
+      </w:r>
+      <w:r>
+        <w:t xml:space="preserve">entiende que la población es un conjunto de personas, objetos o elementos que </w:t>
+      </w:r>
+      <w:r>
+        <w:t>poseen características en común, ya sean demográficas, sociales o que se encuentren en un área geográfica</w:t>
+      </w:r>
+      <w:r>
+        <w:t xml:space="preserve"> </w:t>
+      </w:r>
+      <w:r>
+        <w:lastRenderedPageBreak/>
+        <w:t>determinada</w:t>
+      </w:r>
+      <w:r>
+        <w:t>. Con respecto a la muestra, Hernández, Fernández y Baptista (2014) sostienen que u</w:t>
+      </w:r>
+      <w:r>
+        <w:t>na muestra es un subgrupo de la población del cual se recolectan los datos y debe ser representativo de dicha población</w:t>
+      </w:r>
+      <w:r>
+        <w:t>.</w:t>
+      </w:r>
+      <w:r>
+        <w:t xml:space="preserve"> </w:t>
+      </w:r>
+      <w:r>
+        <w:t>D</w:t>
+      </w:r>
+      <w:r>
+        <w:t xml:space="preserve">e forma </w:t>
+      </w:r>
+      <w:r>
+        <w:t xml:space="preserve">similar, </w:t>
+      </w:r>
+      <w:r>
+        <w:t>Bisquerra (2004) describe a la muestra como</w:t>
+      </w:r>
+      <w:r>
+        <w:t xml:space="preserve"> un subconjunto de casos o individuos de una población estadística. Las muestras se obtienen con la intención de inferir propiedades de la totalidad de la población</w:t>
+      </w:r>
+      <w:r>
+        <w:t>.</w:t>
+      </w:r>
+    </w:p>
+    <w:p>
+      <w:pPr>
+        <w:pStyle w:val="Tesis"/>
+      </w:pPr>
+      <w:r>
+        <w:t>Gracias a las definiciones y descripciones de los autores anteriores, podemos deducir que una muestra es un conjunto seleccionado de sujetos u objetos pertenecientes a una población en particular, con el objetivo de conocer o estudiar las características o propiedades de la población en cuestión.</w:t>
+      </w:r>
+      <w:r>
+        <w:t xml:space="preserve"> Para la ejecución de esta investigación, la muestra seleccionada est</w:t>
+      </w:r>
+      <w:r>
+        <w:t>á</w:t>
+      </w:r>
+      <w:r>
+        <w:t xml:space="preserve"> conform</w:t>
+      </w:r>
+      <w:r>
+        <w:t>a</w:t>
+      </w:r>
+      <w:r>
+        <w:t>da por alumnos de</w:t>
+      </w:r>
+      <w:r>
+        <w:t>l Colegio Nuestra Sra. De Guadalupe.</w:t>
+      </w:r>
+    </w:p>
+    <w:p>
+      <w:pPr>
+        <w:spacing w:after="0" w:line="240" w:lineRule="auto"/>
+        <w:jc w:val="center"/>
         <w:rPr>
           <w:rFonts w:ascii="Arial" w:hAnsi="Arial" w:cs="Arial"/>
           <w:b/>
@@ -976,13 +1021,8 @@
           <w:sz w:val="24"/>
           <w:szCs w:val="24"/>
         </w:rPr>
-        <w:t>CUADRO 1</w:t>
-      </w:r>
-    </w:p>
-    <w:p>
-      <w:pPr>
-        <w:spacing w:after="0" w:line="480" w:lineRule="auto"/>
-        <w:jc w:val="center"/>
+      </w:pPr>
+      <w:r>
         <w:rPr>
           <w:rFonts w:ascii="Arial" w:hAnsi="Arial" w:cs="Arial"/>
           <w:b/>
@@ -990,12 +1030,41 @@
           <w:sz w:val="24"/>
           <w:szCs w:val="24"/>
         </w:rPr>
-      </w:pPr>
+        <w:t>CUADRO</w:t>
+      </w:r>
       <w:r>
         <w:rPr>
           <w:rFonts w:ascii="Arial" w:hAnsi="Arial" w:cs="Arial"/>
           <w:b/>
           <w:bCs/>
+          <w:sz w:val="24"/>
+          <w:szCs w:val="24"/>
+        </w:rPr>
+        <w:t xml:space="preserve"> N°</w:t>
+      </w:r>
+      <w:r>
+        <w:rPr>
+          <w:rFonts w:ascii="Arial" w:hAnsi="Arial" w:cs="Arial"/>
+          <w:b/>
+          <w:bCs/>
+          <w:sz w:val="24"/>
+          <w:szCs w:val="24"/>
+        </w:rPr>
+        <w:t>1</w:t>
+      </w:r>
+      <w:r>
+        <w:rPr>
+          <w:rFonts w:ascii="Arial" w:hAnsi="Arial" w:cs="Arial"/>
+          <w:b/>
+          <w:bCs/>
+          <w:sz w:val="24"/>
+          <w:szCs w:val="24"/>
+        </w:rPr>
+        <w:t xml:space="preserve">. </w:t>
+      </w:r>
+      <w:r>
+        <w:rPr>
+          <w:rFonts w:ascii="Arial" w:hAnsi="Arial" w:cs="Arial"/>
           <w:sz w:val="24"/>
           <w:szCs w:val="24"/>
         </w:rPr>
@@ -1334,14 +1403,16 @@
         </w:rPr>
         <w:t xml:space="preserve">Fuente: </w:t>
       </w:r>
+      <w:proofErr w:type="spellStart"/>
       <w:r>
         <w:rPr>
           <w:rFonts w:ascii="Arial" w:hAnsi="Arial" w:cs="Arial"/>
           <w:sz w:val="24"/>
           <w:szCs w:val="24"/>
         </w:rPr>
-        <w:t>Araujo</w:t>
-      </w:r>
+        <w:t>Acurero</w:t>
+      </w:r>
+      <w:proofErr w:type="spellEnd"/>
       <w:r>
         <w:rPr>
           <w:rFonts w:ascii="Arial" w:hAnsi="Arial" w:cs="Arial"/>
@@ -1356,25 +1427,23 @@
           <w:sz w:val="24"/>
           <w:szCs w:val="24"/>
         </w:rPr>
-        <w:t xml:space="preserve">Montiel, </w:t>
-      </w:r>
-      <w:proofErr w:type="spellStart"/>
+        <w:t>Araujo</w:t>
+      </w:r>
       <w:r>
         <w:rPr>
           <w:rFonts w:ascii="Arial" w:hAnsi="Arial" w:cs="Arial"/>
           <w:sz w:val="24"/>
           <w:szCs w:val="24"/>
         </w:rPr>
-        <w:t>Acurero</w:t>
-      </w:r>
-      <w:proofErr w:type="spellEnd"/>
+        <w:t xml:space="preserve">, </w:t>
+      </w:r>
       <w:r>
         <w:rPr>
           <w:rFonts w:ascii="Arial" w:hAnsi="Arial" w:cs="Arial"/>
           <w:sz w:val="24"/>
           <w:szCs w:val="24"/>
         </w:rPr>
-        <w:t xml:space="preserve"> (202</w:t>
+        <w:t>Montiel (202</w:t>
       </w:r>
       <w:r>
         <w:rPr>
@@ -1437,7 +1506,11 @@
           <w:szCs w:val="24"/>
         </w:rPr>
       </w:pPr>
-      <w:r>
+    </w:p>
+    <w:p>
+      <w:pPr>
+        <w:spacing w:line="480" w:lineRule="auto"/>
+        <w:jc w:val="both"/>
         <w:rPr>
           <w:rFonts w:ascii="Arial" w:hAnsi="Arial" w:cs="Arial"/>
           <w:b/>
@@ -1445,9 +1518,7 @@
           <w:sz w:val="24"/>
           <w:szCs w:val="24"/>
         </w:rPr>
-        <w:lastRenderedPageBreak/>
-        <w:t>3. TECNICAS E INSTRUMENTOS DE RECOLECCI</w:t>
-      </w:r>
+      </w:pPr>
       <w:r>
         <w:rPr>
           <w:rFonts w:ascii="Arial" w:hAnsi="Arial" w:cs="Arial"/>
@@ -1456,7 +1527,8 @@
           <w:sz w:val="24"/>
           <w:szCs w:val="24"/>
         </w:rPr>
-        <w:t>Ó</w:t>
+        <w:lastRenderedPageBreak/>
+        <w:t>3. TECNICAS E INSTRUMENTOS DE RECOLECCI</w:t>
       </w:r>
       <w:r>
         <w:rPr>
@@ -1466,68 +1538,9 @@
           <w:sz w:val="24"/>
           <w:szCs w:val="24"/>
         </w:rPr>
-        <w:t>N DE DATOS</w:t>
-      </w:r>
-    </w:p>
-    <w:p>
-      <w:pPr>
-        <w:pStyle w:val="Tesis"/>
-      </w:pPr>
-      <w:r>
-        <w:t xml:space="preserve">De acuerdo a Hernández (2018), las técnicas de recolección de datos se refieren al procedimiento, manera de hacer algo o estrategia que utiliza el investigador para obtener la información necesaria para el estudio. Son los métodos generales que guían la obtención de datos. Del mismo modo Augusto (2016) afirma que las técnicas de recolección de datos son los procedimientos, formas o métodos, que permiten obtener información para dar respuesta a las preguntas de investigación. </w:t>
-      </w:r>
-    </w:p>
-    <w:p>
-      <w:pPr>
-        <w:pStyle w:val="Tesis"/>
-      </w:pPr>
-      <w:r>
-        <w:t>Entre las técnicas más comunes se encuentran la entrevista, la encuesta, la observación y el análisis documental.</w:t>
-      </w:r>
-      <w:r>
-        <w:t xml:space="preserve"> Es evidente entonces que las técnicas de recolección de datos son un conjunto de estrategias que se usan al momento de recopilar los datos para una investigación.</w:t>
-      </w:r>
-      <w:r>
-        <w:t xml:space="preserve"> </w:t>
-      </w:r>
-      <w:r>
-        <w:t xml:space="preserve">Volviendo con Hernández (2012), menciona que los instrumentos de recolección de datos </w:t>
-      </w:r>
-      <w:r>
-        <w:t xml:space="preserve">son los medios materiales, las herramientas o recursos que se emplean para registrar y almacenar la información obtenida </w:t>
-      </w:r>
-      <w:r>
-        <w:t xml:space="preserve">utilizando </w:t>
-      </w:r>
-      <w:r>
-        <w:t>las técnicas. Son los dispositivos específicos como cuestionarios, guías de observación, listas de verificación o escalas de medición.</w:t>
-      </w:r>
-      <w:r>
-        <w:t xml:space="preserve"> </w:t>
-      </w:r>
-    </w:p>
-    <w:p>
-      <w:pPr>
-        <w:pStyle w:val="Tesis"/>
-      </w:pPr>
-      <w:r>
-        <w:t>Además, Sabino (2014) afirma que l</w:t>
-      </w:r>
-      <w:r>
-        <w:t>a técnica es el procedimiento general que se sigue para obtener datos, mientras que el instrumento es el soporte concreto que se utiliza para aplicar esa técnica.</w:t>
-      </w:r>
-      <w:r>
-        <w:t xml:space="preserve"> Por lo tanto, los </w:t>
-      </w:r>
-      <w:r>
-        <w:lastRenderedPageBreak/>
-        <w:t>instrumentos de recolección de datos son herramientas o recursos que se usan para recopilar información durante una investigación de campo.</w:t>
-      </w:r>
-    </w:p>
-    <w:p>
-      <w:pPr>
-        <w:spacing w:line="480" w:lineRule="auto"/>
-        <w:jc w:val="both"/>
+        <w:t>Ó</w:t>
+      </w:r>
+      <w:r>
         <w:rPr>
           <w:rFonts w:ascii="Arial" w:hAnsi="Arial" w:cs="Arial"/>
           <w:b/>
@@ -1535,8 +1548,68 @@
           <w:sz w:val="24"/>
           <w:szCs w:val="24"/>
         </w:rPr>
-      </w:pPr>
-      <w:r>
+        <w:t>N DE DATOS</w:t>
+      </w:r>
+    </w:p>
+    <w:p>
+      <w:pPr>
+        <w:pStyle w:val="Tesis"/>
+      </w:pPr>
+      <w:r>
+        <w:t xml:space="preserve">De acuerdo a Hernández (2018), las técnicas de recolección de datos se refieren al procedimiento, manera de hacer algo o estrategia que utiliza el investigador para obtener la información necesaria para el estudio. Son los métodos generales que guían la obtención de datos. Del mismo modo Augusto (2016) afirma que las técnicas de recolección de datos son los procedimientos, formas o métodos, que permiten obtener información para dar respuesta a las preguntas de investigación. </w:t>
+      </w:r>
+    </w:p>
+    <w:p>
+      <w:pPr>
+        <w:pStyle w:val="Tesis"/>
+      </w:pPr>
+      <w:r>
+        <w:t>Entre las técnicas más comunes se encuentran la entrevista, la encuesta, la observación y el análisis documental.</w:t>
+      </w:r>
+      <w:r>
+        <w:t xml:space="preserve"> Es evidente entonces que las técnicas de recolección de datos son un conjunto de estrategias que se usan al momento de recopilar los datos para una investigación.</w:t>
+      </w:r>
+      <w:r>
+        <w:t xml:space="preserve"> </w:t>
+      </w:r>
+      <w:r>
+        <w:t xml:space="preserve">Volviendo con Hernández (2012), menciona que los instrumentos de recolección de datos </w:t>
+      </w:r>
+      <w:r>
+        <w:t xml:space="preserve">son los medios materiales, las herramientas o recursos que se emplean para registrar y almacenar la información obtenida </w:t>
+      </w:r>
+      <w:r>
+        <w:t xml:space="preserve">utilizando </w:t>
+      </w:r>
+      <w:r>
+        <w:t>las técnicas. Son los dispositivos específicos como cuestionarios, guías de observación, listas de verificación o escalas de medición.</w:t>
+      </w:r>
+      <w:r>
+        <w:t xml:space="preserve"> </w:t>
+      </w:r>
+    </w:p>
+    <w:p>
+      <w:pPr>
+        <w:pStyle w:val="Tesis"/>
+      </w:pPr>
+      <w:r>
+        <w:t>Además, Sabino (2014) afirma que l</w:t>
+      </w:r>
+      <w:r>
+        <w:t>a técnica es el procedimiento general que se sigue para obtener datos, mientras que el instrumento es el soporte concreto que se utiliza para aplicar esa técnica.</w:t>
+      </w:r>
+      <w:r>
+        <w:t xml:space="preserve"> Por lo tanto, los </w:t>
+      </w:r>
+      <w:r>
+        <w:lastRenderedPageBreak/>
+        <w:t>instrumentos de recolección de datos son herramientas o recursos que se usan para recopilar información durante una investigación de campo.</w:t>
+      </w:r>
+    </w:p>
+    <w:p>
+      <w:pPr>
+        <w:spacing w:line="480" w:lineRule="auto"/>
+        <w:jc w:val="both"/>
         <w:rPr>
           <w:rFonts w:ascii="Arial" w:hAnsi="Arial" w:cs="Arial"/>
           <w:b/>
@@ -1544,55 +1617,8 @@
           <w:sz w:val="24"/>
           <w:szCs w:val="24"/>
         </w:rPr>
-        <w:t>3.1 ENCUESTA</w:t>
-      </w:r>
-    </w:p>
-    <w:p>
-      <w:pPr>
-        <w:pStyle w:val="Tesis"/>
-      </w:pPr>
-      <w:r>
-        <w:t xml:space="preserve">Según </w:t>
-      </w:r>
-      <w:proofErr w:type="spellStart"/>
-      <w:r>
-        <w:t>D’ancona</w:t>
-      </w:r>
-      <w:proofErr w:type="spellEnd"/>
-      <w:r>
-        <w:t xml:space="preserve"> (2004), una encuesta </w:t>
-      </w:r>
-      <w:r>
-        <w:t>es una técnica de investigación social sistémica que, mediante la aplicación de instrumentos de medición (cuestionarios) a una muestra estadísticamente representativa, permite recoger, procesar y analizar datos para inferir conclusiones generalizables a una población.</w:t>
-      </w:r>
-      <w:r>
-        <w:t xml:space="preserve"> También, Bravo (1991) declara que l</w:t>
-      </w:r>
-      <w:r>
-        <w:t>a encuesta es una investigación realizada sobre una muestra de sujetos representativa de un colectivo más amplio, utilizando procedimientos estandarizados de interrogación con el fin de obtener mediciones cuantitativas de una gran variedad de características objetivas y subjetivas de la población.</w:t>
-      </w:r>
-    </w:p>
-    <w:p>
-      <w:pPr>
-        <w:pStyle w:val="Tesis"/>
-      </w:pPr>
-      <w:r>
-        <w:t xml:space="preserve">En función de lo planteado por los autores podemos decir que una encuesta, es una técnica de investigación y recolección de datos, en la cual se emplea un conjunto de preguntas predefinidas </w:t>
-      </w:r>
-      <w:r>
-        <w:t xml:space="preserve">(cuestionario) </w:t>
-      </w:r>
-      <w:r>
-        <w:t>sobre una muestra de sujetos, con el objetivo de medir cuantitativamente las variables y características de una población</w:t>
-      </w:r>
-      <w:r>
-        <w:t>.</w:t>
-      </w:r>
-    </w:p>
-    <w:p>
-      <w:pPr>
-        <w:spacing w:line="480" w:lineRule="auto"/>
-        <w:jc w:val="both"/>
+      </w:pPr>
+      <w:r>
         <w:rPr>
           <w:rFonts w:ascii="Arial" w:hAnsi="Arial" w:cs="Arial"/>
           <w:b/>
@@ -1600,8 +1626,55 @@
           <w:sz w:val="24"/>
           <w:szCs w:val="24"/>
         </w:rPr>
-      </w:pPr>
-      <w:r>
+        <w:t>3.1 ENCUESTA</w:t>
+      </w:r>
+    </w:p>
+    <w:p>
+      <w:pPr>
+        <w:pStyle w:val="Tesis"/>
+      </w:pPr>
+      <w:r>
+        <w:t xml:space="preserve">Según </w:t>
+      </w:r>
+      <w:proofErr w:type="spellStart"/>
+      <w:r>
+        <w:t>D’ancona</w:t>
+      </w:r>
+      <w:proofErr w:type="spellEnd"/>
+      <w:r>
+        <w:t xml:space="preserve"> (2004), una encuesta </w:t>
+      </w:r>
+      <w:r>
+        <w:t>es una técnica de investigación social sistémica que, mediante la aplicación de instrumentos de medición (cuestionarios) a una muestra estadísticamente representativa, permite recoger, procesar y analizar datos para inferir conclusiones generalizables a una población.</w:t>
+      </w:r>
+      <w:r>
+        <w:t xml:space="preserve"> También, Bravo (1991) declara que l</w:t>
+      </w:r>
+      <w:r>
+        <w:t>a encuesta es una investigación realizada sobre una muestra de sujetos representativa de un colectivo más amplio, utilizando procedimientos estandarizados de interrogación con el fin de obtener mediciones cuantitativas de una gran variedad de características objetivas y subjetivas de la población.</w:t>
+      </w:r>
+    </w:p>
+    <w:p>
+      <w:pPr>
+        <w:pStyle w:val="Tesis"/>
+      </w:pPr>
+      <w:r>
+        <w:t xml:space="preserve">En función de lo planteado por los autores podemos decir que una encuesta, es una técnica de investigación y recolección de datos, en la cual se emplea un conjunto de preguntas predefinidas </w:t>
+      </w:r>
+      <w:r>
+        <w:t xml:space="preserve">(cuestionario) </w:t>
+      </w:r>
+      <w:r>
+        <w:t>sobre una muestra de sujetos, con el objetivo de medir cuantitativamente las variables y características de una población</w:t>
+      </w:r>
+      <w:r>
+        <w:t>.</w:t>
+      </w:r>
+    </w:p>
+    <w:p>
+      <w:pPr>
+        <w:spacing w:line="480" w:lineRule="auto"/>
+        <w:jc w:val="both"/>
         <w:rPr>
           <w:rFonts w:ascii="Arial" w:hAnsi="Arial" w:cs="Arial"/>
           <w:b/>
@@ -1609,80 +1682,8 @@
           <w:sz w:val="24"/>
           <w:szCs w:val="24"/>
         </w:rPr>
-        <w:t>3.2 CUESTIONARIO</w:t>
-      </w:r>
-    </w:p>
-    <w:p>
-      <w:pPr>
-        <w:pStyle w:val="Tesis"/>
-      </w:pPr>
-      <w:r>
-        <w:t>Volviendo con Ander-</w:t>
-      </w:r>
-      <w:proofErr w:type="spellStart"/>
-      <w:r>
-        <w:t>Egg</w:t>
-      </w:r>
-      <w:proofErr w:type="spellEnd"/>
-      <w:r>
-        <w:t xml:space="preserve"> (2003) Señala que el cuestionario </w:t>
-      </w:r>
-      <w:r>
-        <w:t xml:space="preserve">es un instrumento de investigación que utiliza una serie de preguntas para recoger la información necesaria respecto al problema que se investiga. Las preguntas </w:t>
-      </w:r>
-      <w:r>
-        <w:lastRenderedPageBreak/>
-        <w:t>se refieren a hechos, opiniones, actitudes o aspectos de la realidad que interesan al investigador.</w:t>
-      </w:r>
-      <w:r>
-        <w:t xml:space="preserve"> Igualmente,</w:t>
-      </w:r>
-      <w:r>
-        <w:t xml:space="preserve"> García (2009) e</w:t>
-      </w:r>
-      <w:r>
-        <w:t>l cuestionario es un procedimiento de investigación que consiste en una lista más o menos extensa de preguntas, dirigidas a una muestra representativa, para averiguar estados de opinión o diversas características de la población.</w:t>
-      </w:r>
-      <w:r>
-        <w:t xml:space="preserve"> </w:t>
-      </w:r>
-    </w:p>
-    <w:p>
-      <w:pPr>
-        <w:pStyle w:val="Tesis"/>
-      </w:pPr>
-      <w:r>
-        <w:t>Basados en los conceptos previamente mencionados, se puede definir al cuestionario como un instrumento de recolección de datos que consiste en un conjunto de preguntas, que pueden hacer referencia a hechos u opiniones de los sujetos encuestados</w:t>
-      </w:r>
-      <w:r>
-        <w:t>.</w:t>
-      </w:r>
-      <w:r>
-        <w:t xml:space="preserve"> Para esta investigación, se diseñó un cuestionario de </w:t>
-      </w:r>
-      <w:r>
-        <w:t>1</w:t>
-      </w:r>
-      <w:r>
-        <w:t>4</w:t>
-      </w:r>
-      <w:r>
-        <w:t xml:space="preserve"> preguntas; </w:t>
-      </w:r>
-      <w:r>
-        <w:t>9</w:t>
-      </w:r>
-      <w:r>
-        <w:t xml:space="preserve"> son preguntas cerradas, 3 son mixtas, 1 es de escala numérica y 1 es abierta</w:t>
-      </w:r>
-      <w:r>
-        <w:t>, con el objetivo de recopilar información sobre las preferencias de los estudiantes y su comportamiento al momento de estudiar, así como para tomar en cuenta también diferentes opiniones para incluir funcionalidades necesarias para poder ofrecer un producto competente y funcional.</w:t>
-      </w:r>
-    </w:p>
-    <w:p>
-      <w:pPr>
-        <w:spacing w:line="480" w:lineRule="auto"/>
-        <w:jc w:val="both"/>
+      </w:pPr>
+      <w:r>
         <w:rPr>
           <w:rFonts w:ascii="Arial" w:hAnsi="Arial" w:cs="Arial"/>
           <w:b/>
@@ -1690,8 +1691,80 @@
           <w:sz w:val="24"/>
           <w:szCs w:val="24"/>
         </w:rPr>
-      </w:pPr>
-      <w:r>
+        <w:t>3.2 CUESTIONARIO</w:t>
+      </w:r>
+    </w:p>
+    <w:p>
+      <w:pPr>
+        <w:pStyle w:val="Tesis"/>
+      </w:pPr>
+      <w:r>
+        <w:t>Volviendo con Ander-</w:t>
+      </w:r>
+      <w:proofErr w:type="spellStart"/>
+      <w:r>
+        <w:t>Egg</w:t>
+      </w:r>
+      <w:proofErr w:type="spellEnd"/>
+      <w:r>
+        <w:t xml:space="preserve"> (2003) Señala que el cuestionario </w:t>
+      </w:r>
+      <w:r>
+        <w:t xml:space="preserve">es un instrumento de investigación que utiliza una serie de preguntas para recoger la información necesaria respecto al problema que se investiga. Las preguntas </w:t>
+      </w:r>
+      <w:r>
+        <w:lastRenderedPageBreak/>
+        <w:t>se refieren a hechos, opiniones, actitudes o aspectos de la realidad que interesan al investigador.</w:t>
+      </w:r>
+      <w:r>
+        <w:t xml:space="preserve"> Igualmente,</w:t>
+      </w:r>
+      <w:r>
+        <w:t xml:space="preserve"> García (2009) e</w:t>
+      </w:r>
+      <w:r>
+        <w:t>l cuestionario es un procedimiento de investigación que consiste en una lista más o menos extensa de preguntas, dirigidas a una muestra representativa, para averiguar estados de opinión o diversas características de la población.</w:t>
+      </w:r>
+      <w:r>
+        <w:t xml:space="preserve"> </w:t>
+      </w:r>
+    </w:p>
+    <w:p>
+      <w:pPr>
+        <w:pStyle w:val="Tesis"/>
+      </w:pPr>
+      <w:r>
+        <w:t>Basados en los conceptos previamente mencionados, se puede definir al cuestionario como un instrumento de recolección de datos que consiste en un conjunto de preguntas, que pueden hacer referencia a hechos u opiniones de los sujetos encuestados</w:t>
+      </w:r>
+      <w:r>
+        <w:t>.</w:t>
+      </w:r>
+      <w:r>
+        <w:t xml:space="preserve"> Para esta investigación, se diseñó un cuestionario de </w:t>
+      </w:r>
+      <w:r>
+        <w:t>1</w:t>
+      </w:r>
+      <w:r>
+        <w:t>4</w:t>
+      </w:r>
+      <w:r>
+        <w:t xml:space="preserve"> preguntas; </w:t>
+      </w:r>
+      <w:r>
+        <w:t>9</w:t>
+      </w:r>
+      <w:r>
+        <w:t xml:space="preserve"> son preguntas cerradas, 3 son mixtas, 1 es de escala numérica y 1 es abierta</w:t>
+      </w:r>
+      <w:r>
+        <w:t>, con el objetivo de recopilar información sobre las preferencias de los estudiantes y su comportamiento al momento de estudiar, así como para tomar en cuenta también diferentes opiniones para incluir funcionalidades necesarias para poder ofrecer un producto competente y funcional.</w:t>
+      </w:r>
+    </w:p>
+    <w:p>
+      <w:pPr>
+        <w:spacing w:line="480" w:lineRule="auto"/>
+        <w:jc w:val="both"/>
         <w:rPr>
           <w:rFonts w:ascii="Arial" w:hAnsi="Arial" w:cs="Arial"/>
           <w:b/>
@@ -1699,41 +1772,8 @@
           <w:sz w:val="24"/>
           <w:szCs w:val="24"/>
         </w:rPr>
-        <w:t>4. METODOLOGÍA SELECCIONADA</w:t>
-      </w:r>
-    </w:p>
-    <w:p>
-      <w:pPr>
-        <w:pStyle w:val="Tesis"/>
-      </w:pPr>
-      <w:r>
-        <w:t xml:space="preserve">Luego de analizar diversas metodologías aplicables al desarrollo de software educativo, se concluyó que la opción más adecuada para esta investigación es la metodología propuesta por Roger S. Pressman (2010), en específico el Modelo en Cascada. Este enfoque se basa en principios de ingeniería de software que promueven un desarrollo sistemático y </w:t>
-      </w:r>
-      <w:r>
-        <w:lastRenderedPageBreak/>
-        <w:t xml:space="preserve">estructurado, orientado a garantizar la calidad del producto final. Pressman plantea que todo proceso de software debe estar compuesto por un conjunto de actividades estructurales, aplicables a cualquier tipo de proyecto, sin importar su tamaño o complejidad. </w:t>
-      </w:r>
-    </w:p>
-    <w:p>
-      <w:pPr>
-        <w:pStyle w:val="Tesis"/>
-      </w:pPr>
-      <w:r>
-        <w:t xml:space="preserve">En el caso de esta investigación, se aplicará dicha metodología para el desarrollo de una aplicación educativa </w:t>
-      </w:r>
-      <w:proofErr w:type="spellStart"/>
-      <w:r>
-        <w:t>gamificada</w:t>
-      </w:r>
-      <w:proofErr w:type="spellEnd"/>
-      <w:r>
-        <w:t>, desarrollada en Python, orientada a potenciar el rendimiento académico de estudiantes de bachillerato en Venezuela. Estas actividades permiten organizar el trabajo, minimizar riesgos, controlar el avance del desarrollo y asegurar que los requerimientos del usuario sean correctamente satisfechos.</w:t>
-      </w:r>
-    </w:p>
-    <w:p>
-      <w:pPr>
-        <w:spacing w:line="480" w:lineRule="auto"/>
-        <w:jc w:val="both"/>
+      </w:pPr>
+      <w:r>
         <w:rPr>
           <w:rFonts w:ascii="Arial" w:hAnsi="Arial" w:cs="Arial"/>
           <w:b/>
@@ -1741,8 +1781,41 @@
           <w:sz w:val="24"/>
           <w:szCs w:val="24"/>
         </w:rPr>
-      </w:pPr>
-      <w:r>
+        <w:t>4. METODOLOGÍA SELECCIONADA</w:t>
+      </w:r>
+    </w:p>
+    <w:p>
+      <w:pPr>
+        <w:pStyle w:val="Tesis"/>
+      </w:pPr>
+      <w:r>
+        <w:t xml:space="preserve">Luego de analizar diversas metodologías aplicables al desarrollo de software educativo, se concluyó que la opción más adecuada para esta investigación es la metodología propuesta por Roger S. Pressman (2010), en específico el Modelo en Cascada. Este enfoque se basa en principios de ingeniería de software que promueven un desarrollo sistemático y </w:t>
+      </w:r>
+      <w:r>
+        <w:lastRenderedPageBreak/>
+        <w:t xml:space="preserve">estructurado, orientado a garantizar la calidad del producto final. Pressman plantea que todo proceso de software debe estar compuesto por un conjunto de actividades estructurales, aplicables a cualquier tipo de proyecto, sin importar su tamaño o complejidad. </w:t>
+      </w:r>
+    </w:p>
+    <w:p>
+      <w:pPr>
+        <w:pStyle w:val="Tesis"/>
+      </w:pPr>
+      <w:r>
+        <w:t xml:space="preserve">En el caso de esta investigación, se aplicará dicha metodología para el desarrollo de una aplicación educativa </w:t>
+      </w:r>
+      <w:proofErr w:type="spellStart"/>
+      <w:r>
+        <w:t>gamificada</w:t>
+      </w:r>
+      <w:proofErr w:type="spellEnd"/>
+      <w:r>
+        <w:t>, desarrollada en Python, orientada a potenciar el rendimiento académico de estudiantes de bachillerato en Venezuela. Estas actividades permiten organizar el trabajo, minimizar riesgos, controlar el avance del desarrollo y asegurar que los requerimientos del usuario sean correctamente satisfechos.</w:t>
+      </w:r>
+    </w:p>
+    <w:p>
+      <w:pPr>
+        <w:spacing w:line="480" w:lineRule="auto"/>
+        <w:jc w:val="both"/>
         <w:rPr>
           <w:rFonts w:ascii="Arial" w:hAnsi="Arial" w:cs="Arial"/>
           <w:b/>
@@ -1750,42 +1823,8 @@
           <w:sz w:val="24"/>
           <w:szCs w:val="24"/>
         </w:rPr>
-        <w:t>FASE I: COMUNICACIÓN</w:t>
-      </w:r>
-    </w:p>
-    <w:p>
-      <w:pPr>
-        <w:pStyle w:val="Tesis"/>
-      </w:pPr>
-      <w:r>
-        <w:t xml:space="preserve">Esta fase tiene como propósito establecer una comprensión clara y profunda de las necesidades del usuario final. Se busca identificar los objetivos pedagógicos, las limitaciones tecnológicas del entorno educativo y las expectativas funcionales del sistema. Pressman (2010, p. 13), señala que antes de que comience cualquier trabajo técnico, tiene importancia crítica comunicarse y colaborar con el cliente (y con otros participantes), se busca entender los objetivos de los participantes respecto del proyecto, y reunir los requerimientos que ayuden a definir las características y funciones del software. </w:t>
-      </w:r>
-    </w:p>
-    <w:p>
-      <w:pPr>
-        <w:pStyle w:val="Tesis"/>
-      </w:pPr>
-      <w:r>
-        <w:lastRenderedPageBreak/>
-        <w:t>Para Pressman (2010, p. 29) es evidente que un equipo de software necesitará mucha más información antes de poder ejecutar de manera apropiada cualquiera de ellas como parte del proceso del software. Además, cada acción de la ingeniería de software se representa por cierto número de distintos conjuntos de tareas, cada uno de los cuales es una colección de tareas de trabajo de la ingeniería de software, relacionadas con productos del trabajo, puntos de aseguramiento de la calidad y puntos de referencia del proyecto. Debe escogerse el conjunto de tareas que se adapte mejor a las necesidades del proyecto y a las características del equipo. Esto implica que una acción de la ingeniería de software puede adaptarse a las necesidades específicas del proyecto de software y a las características del equipo del proyecto.</w:t>
-      </w:r>
-    </w:p>
-    <w:p>
-      <w:pPr>
-        <w:pStyle w:val="Tesis"/>
-        <w:rPr>
-          <w:b/>
-          <w:bCs/>
-        </w:rPr>
-      </w:pPr>
-      <w:r>
-        <w:t>En esta fase también va incluido el análisis de los requerimientos previamente identificados, de acuerdo a Pressman (p, 127) este análisis da como resultado la especificación de las características operativas del software, indica la interfaz de éste y otros elementos del sistema, y establece las restricciones que limitan al software. El análisis de los requerimientos permite al profesional construir sobre los requerimientos básicos establecidos durante las tareas de concepción, indagación y negociación, que son parte de la ingeniería de los requerimientos</w:t>
-      </w:r>
-    </w:p>
-    <w:p>
-      <w:pPr>
-        <w:spacing w:line="480" w:lineRule="auto"/>
-        <w:jc w:val="both"/>
+      </w:pPr>
+      <w:r>
         <w:rPr>
           <w:rFonts w:ascii="Arial" w:hAnsi="Arial" w:cs="Arial"/>
           <w:b/>
@@ -1793,8 +1832,47 @@
           <w:sz w:val="24"/>
           <w:szCs w:val="24"/>
         </w:rPr>
-      </w:pPr>
-      <w:r>
+        <w:t>FASE I: COMUNICACIÓN</w:t>
+      </w:r>
+    </w:p>
+    <w:p>
+      <w:pPr>
+        <w:pStyle w:val="Tesis"/>
+      </w:pPr>
+      <w:r>
+        <w:t xml:space="preserve">Esta fase tiene como propósito establecer una comprensión clara y profunda de las necesidades del usuario final. Se busca identificar los objetivos pedagógicos, las limitaciones tecnológicas del entorno educativo y las expectativas funcionales del sistema. Pressman (2010, p. 13), señala que antes de que comience cualquier trabajo técnico, tiene importancia crítica comunicarse y colaborar con el cliente (y con otros participantes), se busca entender los objetivos de los participantes respecto del proyecto, y reunir los requerimientos que ayuden a definir las características y funciones del software. </w:t>
+      </w:r>
+    </w:p>
+    <w:p>
+      <w:pPr>
+        <w:pStyle w:val="Tesis"/>
+      </w:pPr>
+      <w:r>
+        <w:lastRenderedPageBreak/>
+        <w:t>Para Pressman (2010, p. 29) es evidente que un equipo de software necesitará mucha más información antes de poder ejecutar de manera apropiada cualquiera de ellas como parte del proceso del software. Además, cada acción de la ingeniería de software se representa por cierto número de distintos conjuntos de tareas, cada uno de los cuales es una colección de tareas de trabajo de la ingeniería de software, relacionadas con productos del trabajo, puntos de aseguramiento de la calidad y puntos de referencia del proyecto. Debe escogerse el conjunto de tareas que se adapte mejor a las necesidades del proyecto y a las características del equipo. Esto implica que una acción de la ingeniería de software puede adaptarse a las necesidades específicas del proyecto de software y a las características del equipo del proyecto.</w:t>
+      </w:r>
+    </w:p>
+    <w:p>
+      <w:pPr>
+        <w:pStyle w:val="Tesis"/>
+      </w:pPr>
+      <w:r>
+        <w:t>En esta fase también va incluido el análisis de los requerimientos previamente identificados, de acuerdo a Pressman (p, 127) este análisis da como resultado la especificación de las características operativas del software, indica la interfaz de éste y otros elementos del sistema, y establece las restricciones que limitan al software. El análisis de los requerimientos permite al profesional construir sobre los requerimientos básicos establecidos durante las tareas de concepción, indagación y negociación, que son parte de la ingeniería de los requerimientos</w:t>
+      </w:r>
+    </w:p>
+    <w:p>
+      <w:pPr>
+        <w:pStyle w:val="Tesis"/>
+        <w:rPr>
+          <w:b/>
+          <w:bCs/>
+        </w:rPr>
+      </w:pPr>
+    </w:p>
+    <w:p>
+      <w:pPr>
+        <w:spacing w:line="480" w:lineRule="auto"/>
+        <w:jc w:val="both"/>
         <w:rPr>
           <w:rFonts w:ascii="Arial" w:hAnsi="Arial" w:cs="Arial"/>
           <w:b/>
@@ -1802,30 +1880,8 @@
           <w:sz w:val="24"/>
           <w:szCs w:val="24"/>
         </w:rPr>
-        <w:t>FASE II: PLANEACIÓN</w:t>
-      </w:r>
-    </w:p>
-    <w:p>
-      <w:pPr>
-        <w:pStyle w:val="Tesis"/>
-      </w:pPr>
-      <w:r>
-        <w:lastRenderedPageBreak/>
-        <w:t>Para Pressman (p. 13), el desarrollo de un software es como un viaje, y un viaje complicado se simplifica si existe un mapa. Un proyecto de software es un viaje difícil, y la actividad de planeación crea un “mapa” que guía al equipo mientras viaja. El mapa llamado “plan del proyecto de software” define el trabajo de ingeniería de software al describir las tareas técnicas por realizar, los riesgos probables, los recursos que se requieren, los productos del trabajo que se obtendrán y una programación de las actividades.</w:t>
-      </w:r>
-    </w:p>
-    <w:p>
-      <w:pPr>
-        <w:pStyle w:val="Tesis"/>
-      </w:pPr>
-      <w:r>
-        <w:t>Según el autor (p. 49), esta actividad aísla los requerimientos y desarrolla las estimaciones tanto del tamaño como de los recursos. Además, realiza la estimación de los defectos (el número de defectos proyectados para el trabajo). Todas las mediciones se registran en hojas de trabajo o plantillas. Por último, se identifican las tareas de desarrollo y se crea un programa para el proyecto.</w:t>
-      </w:r>
-    </w:p>
-    <w:p>
-      <w:pPr>
-        <w:spacing w:line="480" w:lineRule="auto"/>
-        <w:jc w:val="both"/>
+      </w:pPr>
+      <w:r>
         <w:rPr>
           <w:rFonts w:ascii="Arial" w:hAnsi="Arial" w:cs="Arial"/>
           <w:b/>
@@ -1833,8 +1889,30 @@
           <w:sz w:val="24"/>
           <w:szCs w:val="24"/>
         </w:rPr>
-      </w:pPr>
-      <w:r>
+        <w:lastRenderedPageBreak/>
+        <w:t>FASE II: PLANEACIÓN</w:t>
+      </w:r>
+    </w:p>
+    <w:p>
+      <w:pPr>
+        <w:pStyle w:val="Tesis"/>
+      </w:pPr>
+      <w:r>
+        <w:t>Para Pressman (p. 13), el desarrollo de un software es como un viaje, y un viaje complicado se simplifica si existe un mapa. Un proyecto de software es un viaje difícil, y la actividad de planeación crea un “mapa” que guía al equipo mientras viaja. El mapa llamado “plan del proyecto de software” define el trabajo de ingeniería de software al describir las tareas técnicas por realizar, los riesgos probables, los recursos que se requieren, los productos del trabajo que se obtendrán y una programación de las actividades.</w:t>
+      </w:r>
+    </w:p>
+    <w:p>
+      <w:pPr>
+        <w:pStyle w:val="Tesis"/>
+      </w:pPr>
+      <w:r>
+        <w:t>Según el autor (p. 49), esta actividad aísla los requerimientos y desarrolla las estimaciones tanto del tamaño como de los recursos. Además, realiza la estimación de los defectos (el número de defectos proyectados para el trabajo). Todas las mediciones se registran en hojas de trabajo o plantillas. Por último, se identifican las tareas de desarrollo y se crea un programa para el proyecto.</w:t>
+      </w:r>
+    </w:p>
+    <w:p>
+      <w:pPr>
+        <w:spacing w:line="480" w:lineRule="auto"/>
+        <w:jc w:val="both"/>
         <w:rPr>
           <w:rFonts w:ascii="Arial" w:hAnsi="Arial" w:cs="Arial"/>
           <w:b/>
@@ -1842,37 +1920,8 @@
           <w:sz w:val="24"/>
           <w:szCs w:val="24"/>
         </w:rPr>
-        <w:t>FASE III: MODELADO</w:t>
-      </w:r>
-    </w:p>
-    <w:p>
-      <w:pPr>
-        <w:pStyle w:val="Tesis"/>
-      </w:pPr>
-      <w:r>
-        <w:t xml:space="preserve">Pressman (p, 183) conceptualiza que el diseño o modelado de software agrupa el conjunto de principios, conceptos y prácticas que llevan al desarrollo de un sistema o producto de alta calidad. Los principios de diseño establecen una filosofía general que guía el trabajo de diseño que debe ejecutarse. Deben entenderse los conceptos de diseño antes de aplicar la mecánica de éste, y la práctica del diseño en sí lleva a la creación de distintas representaciones del software que sirve como guía para la actividad de construcción que siga. El </w:t>
-      </w:r>
-      <w:r>
-        <w:lastRenderedPageBreak/>
-        <w:t>objetivo del modelado del software es producir un modelo o representación que tenga resistencia, funcionalidad y belleza. Para lograrlo, debe practicarse la diversificación y luego la convergencia.</w:t>
-      </w:r>
-    </w:p>
-    <w:p>
-      <w:pPr>
-        <w:pStyle w:val="Tesis"/>
-        <w:rPr>
-          <w:b/>
-          <w:bCs/>
-        </w:rPr>
-      </w:pPr>
-      <w:r>
-        <w:t>El diseño de software se ubica en el área técnica de la ingeniería de software y se aplica sin importar el modelo del proceso que se utilice. El diseño del software comienza una vez que se han analizado y modelado los requerimientos, es la última acción de la ingeniería de software dentro de la actividad de modelado y prepara la etapa de construcción (generación y prueba de código). En síntesis, esta fase consiste en transformar los requerimientos recopilados en modelos técnicos que representen la estructura, el comportamiento y la interacción del sistema. Se diseñan diagramas de flujo, estructuras de datos, prototipos de interfaz y lógica de procesos que guiarán la codificación.</w:t>
-      </w:r>
-    </w:p>
-    <w:p>
-      <w:pPr>
-        <w:spacing w:line="480" w:lineRule="auto"/>
-        <w:jc w:val="both"/>
+      </w:pPr>
+      <w:r>
         <w:rPr>
           <w:rFonts w:ascii="Arial" w:hAnsi="Arial" w:cs="Arial"/>
           <w:b/>
@@ -1880,8 +1929,37 @@
           <w:sz w:val="24"/>
           <w:szCs w:val="24"/>
         </w:rPr>
-      </w:pPr>
-      <w:r>
+        <w:t>FASE III: MODELADO</w:t>
+      </w:r>
+    </w:p>
+    <w:p>
+      <w:pPr>
+        <w:pStyle w:val="Tesis"/>
+      </w:pPr>
+      <w:r>
+        <w:t xml:space="preserve">Pressman (p, 183) conceptualiza que el diseño o modelado de software agrupa el conjunto de principios, conceptos y prácticas que llevan al desarrollo de un sistema o producto de alta calidad. Los principios de diseño establecen una filosofía general que guía el trabajo de diseño que debe ejecutarse. Deben entenderse los conceptos de diseño antes de aplicar la mecánica de éste, y la práctica del diseño en sí lleva a la creación de distintas representaciones del </w:t>
+      </w:r>
+      <w:r>
+        <w:lastRenderedPageBreak/>
+        <w:t>software que sirve como guía para la actividad de construcción que siga. El objetivo del modelado del software es producir un modelo o representación que tenga resistencia, funcionalidad y belleza. Para lograrlo, debe practicarse la diversificación y luego la convergencia.</w:t>
+      </w:r>
+    </w:p>
+    <w:p>
+      <w:pPr>
+        <w:pStyle w:val="Tesis"/>
+        <w:rPr>
+          <w:b/>
+          <w:bCs/>
+        </w:rPr>
+      </w:pPr>
+      <w:r>
+        <w:t>El diseño de software se ubica en el área técnica de la ingeniería de software y se aplica sin importar el modelo del proceso que se utilice. El diseño del software comienza una vez que se han analizado y modelado los requerimientos, es la última acción de la ingeniería de software dentro de la actividad de modelado y prepara la etapa de construcción (generación y prueba de código). En síntesis, esta fase consiste en transformar los requerimientos recopilados en modelos técnicos que representen la estructura, el comportamiento y la interacción del sistema. Se diseñan diagramas de flujo, estructuras de datos, prototipos de interfaz y lógica de procesos que guiarán la codificación.</w:t>
+      </w:r>
+    </w:p>
+    <w:p>
+      <w:pPr>
+        <w:spacing w:line="480" w:lineRule="auto"/>
+        <w:jc w:val="both"/>
         <w:rPr>
           <w:rFonts w:ascii="Arial" w:hAnsi="Arial" w:cs="Arial"/>
           <w:b/>
@@ -1889,37 +1967,8 @@
           <w:sz w:val="24"/>
           <w:szCs w:val="24"/>
         </w:rPr>
-        <w:t>FASE IV: CONSTRUCCIÓN</w:t>
-      </w:r>
-    </w:p>
-    <w:p>
-      <w:pPr>
-        <w:pStyle w:val="Tesis"/>
-      </w:pPr>
-      <w:r>
-        <w:t xml:space="preserve">Pressman (p, 13) declara simplemente que esta actividad combina la generación de código o codificación (ya sea manual o automatizada) y las pruebas que se requieren para descubrir errores en éste. La codificación consiste en traducir el modelo, en una forma legible por la máquina, se refiere tanto a la parte de la generación de los ambientes virtuales, como a la parte en la cual se añadirá comportamiento a estos ambientes. Una vez se ha </w:t>
-      </w:r>
-      <w:r>
-        <w:lastRenderedPageBreak/>
-        <w:t>generado el código, comienzan las pruebas del software que se ha desarrollado.</w:t>
-      </w:r>
-    </w:p>
-    <w:p>
-      <w:pPr>
-        <w:pStyle w:val="Tesis"/>
-        <w:rPr>
-          <w:b/>
-          <w:bCs/>
-        </w:rPr>
-      </w:pPr>
-      <w:r>
-        <w:t>Por eso, el autor afirma que debe haber una estrategia de prueba de software proporciona una guía que describe los pasos que deben realizarse como parte de la prueba, cuándo se planean y se llevan a cabo dichos pasos, y cuánto esfuerzo, tiempo y recursos se requerirán. Cualquier estrategia de prueba que se vaya a poner en práctica debe incorporar la planificación de la prueba, el diseño de casos de prueba, la ejecución de la prueba y la recolección y evaluación de los resultados. Una estrategia de prueba de software debe ser suficientemente flexible para promover un uso personalizado de la prueba. Al mismo tiempo, debe ser suficientemente rígida para alentar la planificación razonable y el seguimiento de la gestión conforme avanza el proyecto.</w:t>
-      </w:r>
-    </w:p>
-    <w:p>
-      <w:pPr>
-        <w:spacing w:line="480" w:lineRule="auto"/>
-        <w:jc w:val="both"/>
+      </w:pPr>
+      <w:r>
         <w:rPr>
           <w:rFonts w:ascii="Arial" w:hAnsi="Arial" w:cs="Arial"/>
           <w:b/>
@@ -1927,8 +1976,37 @@
           <w:sz w:val="24"/>
           <w:szCs w:val="24"/>
         </w:rPr>
-      </w:pPr>
-      <w:r>
+        <w:t>FASE IV: CONSTRUCCIÓN</w:t>
+      </w:r>
+    </w:p>
+    <w:p>
+      <w:pPr>
+        <w:pStyle w:val="Tesis"/>
+      </w:pPr>
+      <w:r>
+        <w:t xml:space="preserve">Pressman (p, 13) declara simplemente que esta actividad combina la generación de código o codificación (ya sea manual o automatizada) y las pruebas que se requieren para descubrir errores en éste. La codificación consiste en traducir el modelo, en una forma legible por la máquina, se refiere tanto a la parte de la generación de los ambientes virtuales, como a la parte en la cual se añadirá comportamiento a estos ambientes. Una vez se ha </w:t>
+      </w:r>
+      <w:r>
+        <w:lastRenderedPageBreak/>
+        <w:t>generado el código, comienzan las pruebas del software que se ha desarrollado.</w:t>
+      </w:r>
+    </w:p>
+    <w:p>
+      <w:pPr>
+        <w:pStyle w:val="Tesis"/>
+        <w:rPr>
+          <w:b/>
+          <w:bCs/>
+        </w:rPr>
+      </w:pPr>
+      <w:r>
+        <w:t>Por eso, el autor afirma que debe haber una estrategia de prueba de software proporciona una guía que describe los pasos que deben realizarse como parte de la prueba, cuándo se planean y se llevan a cabo dichos pasos, y cuánto esfuerzo, tiempo y recursos se requerirán. Cualquier estrategia de prueba que se vaya a poner en práctica debe incorporar la planificación de la prueba, el diseño de casos de prueba, la ejecución de la prueba y la recolección y evaluación de los resultados. Una estrategia de prueba de software debe ser suficientemente flexible para promover un uso personalizado de la prueba. Al mismo tiempo, debe ser suficientemente rígida para alentar la planificación razonable y el seguimiento de la gestión conforme avanza el proyecto.</w:t>
+      </w:r>
+    </w:p>
+    <w:p>
+      <w:pPr>
+        <w:spacing w:line="480" w:lineRule="auto"/>
+        <w:jc w:val="both"/>
         <w:rPr>
           <w:rFonts w:ascii="Arial" w:hAnsi="Arial" w:cs="Arial"/>
           <w:b/>
@@ -1936,37 +2014,8 @@
           <w:sz w:val="24"/>
           <w:szCs w:val="24"/>
         </w:rPr>
-        <w:t>FASE V: DESPLIEGUE</w:t>
-      </w:r>
-    </w:p>
-    <w:p>
-      <w:pPr>
-        <w:pStyle w:val="Tesis"/>
-      </w:pPr>
-      <w:r>
-        <w:t xml:space="preserve">Pressman (p, 656) declara que esta fase comienza casi de inmediato. El software se libera a los usuarios finales y, en cuestión de días, los reportes de errores regresan de vuelta hacia la organización. En semanas, una clase de usuarios indica que el software debe cambiarse de modo que pueda ajustarse a las necesidades especiales de su entorno. El mantenimiento del software comienza, uno se enfrenta con una creciente lista de corrección de errores, peticiones de adaptación y mejoras categóricas que deben planearse, </w:t>
-      </w:r>
-      <w:r>
-        <w:lastRenderedPageBreak/>
-        <w:t>calendarizarse y, a final de cuentas, lograrse. Este se logra por medio de una documentación apropiada y atinada del software se pueden presentar las vías para el mantenimiento y modificaciones al mismo</w:t>
-      </w:r>
-    </w:p>
-    <w:p>
-      <w:pPr>
-        <w:pStyle w:val="Tesis"/>
-        <w:rPr>
-          <w:b/>
-          <w:bCs/>
-        </w:rPr>
-      </w:pPr>
-      <w:r>
-        <w:t>Estas cinco actividades estructurales genéricas se usan durante el desarrollo de programas pequeños y sencillos, en la creación de aplicaciones web grandes y en la ingeniería de sistemas enormes y complejos basados en computadoras. Los detalles del proceso de software serán distintos en cada caso, pero las actividades estructurales son las mismas.</w:t>
-      </w:r>
-    </w:p>
-    <w:p>
-      <w:pPr>
-        <w:spacing w:line="480" w:lineRule="auto"/>
-        <w:jc w:val="both"/>
+      </w:pPr>
+      <w:r>
         <w:rPr>
           <w:rFonts w:ascii="Arial" w:hAnsi="Arial" w:cs="Arial"/>
           <w:b/>
@@ -1974,8 +2023,37 @@
           <w:sz w:val="24"/>
           <w:szCs w:val="24"/>
         </w:rPr>
-      </w:pPr>
-      <w:r>
+        <w:t>FASE V: DESPLIEGUE</w:t>
+      </w:r>
+    </w:p>
+    <w:p>
+      <w:pPr>
+        <w:pStyle w:val="Tesis"/>
+      </w:pPr>
+      <w:r>
+        <w:t xml:space="preserve">Pressman (p, 656) declara que esta fase comienza casi de inmediato. El software se libera a los usuarios finales y, en cuestión de días, los reportes de errores regresan de vuelta hacia la organización. En semanas, una clase de usuarios indica que el software debe cambiarse de modo que pueda ajustarse a las necesidades especiales de su entorno. El mantenimiento del software comienza, uno se enfrenta con una creciente lista de corrección de errores, peticiones de adaptación y mejoras categóricas que deben planearse, </w:t>
+      </w:r>
+      <w:r>
+        <w:lastRenderedPageBreak/>
+        <w:t>calendarizarse y, a final de cuentas, lograrse. Este se logra por medio de una documentación apropiada y atinada del software se pueden presentar las vías para el mantenimiento y modificaciones al mismo</w:t>
+      </w:r>
+    </w:p>
+    <w:p>
+      <w:pPr>
+        <w:pStyle w:val="Tesis"/>
+        <w:rPr>
+          <w:b/>
+          <w:bCs/>
+        </w:rPr>
+      </w:pPr>
+      <w:r>
+        <w:t>Estas cinco actividades estructurales genéricas se usan durante el desarrollo de programas pequeños y sencillos, en la creación de aplicaciones web grandes y en la ingeniería de sistemas enormes y complejos basados en computadoras. Los detalles del proceso de software serán distintos en cada caso, pero las actividades estructurales son las mismas.</w:t>
+      </w:r>
+    </w:p>
+    <w:p>
+      <w:pPr>
+        <w:spacing w:line="480" w:lineRule="auto"/>
+        <w:jc w:val="both"/>
         <w:rPr>
           <w:rFonts w:ascii="Arial" w:hAnsi="Arial" w:cs="Arial"/>
           <w:b/>
@@ -1983,8 +2061,7 @@
           <w:sz w:val="24"/>
           <w:szCs w:val="24"/>
         </w:rPr>
-        <w:t>5</w:t>
-      </w:r>
+      </w:pPr>
       <w:r>
         <w:rPr>
           <w:rFonts w:ascii="Arial" w:hAnsi="Arial" w:cs="Arial"/>
@@ -1993,13 +2070,9 @@
           <w:sz w:val="24"/>
           <w:szCs w:val="24"/>
         </w:rPr>
-        <w:t>. CUADRO DE ACTIVIDADES Y CRONOGRAMA</w:t>
-      </w:r>
-    </w:p>
-    <w:p>
-      <w:pPr>
-        <w:spacing w:line="480" w:lineRule="auto"/>
-        <w:jc w:val="both"/>
+        <w:t>5</w:t>
+      </w:r>
+      <w:r>
         <w:rPr>
           <w:rFonts w:ascii="Arial" w:hAnsi="Arial" w:cs="Arial"/>
           <w:b/>
@@ -2007,8 +2080,13 @@
           <w:sz w:val="24"/>
           <w:szCs w:val="24"/>
         </w:rPr>
-      </w:pPr>
-      <w:r>
+        <w:t>. CUADRO DE ACTIVIDADES Y CRONOGRAMA</w:t>
+      </w:r>
+    </w:p>
+    <w:p>
+      <w:pPr>
+        <w:spacing w:line="480" w:lineRule="auto"/>
+        <w:jc w:val="both"/>
         <w:rPr>
           <w:rFonts w:ascii="Arial" w:hAnsi="Arial" w:cs="Arial"/>
           <w:b/>
@@ -2016,8 +2094,7 @@
           <w:sz w:val="24"/>
           <w:szCs w:val="24"/>
         </w:rPr>
-        <w:t>5</w:t>
-      </w:r>
+      </w:pPr>
       <w:r>
         <w:rPr>
           <w:rFonts w:ascii="Arial" w:hAnsi="Arial" w:cs="Arial"/>
@@ -2026,32 +2103,9 @@
           <w:sz w:val="24"/>
           <w:szCs w:val="24"/>
         </w:rPr>
-        <w:t>.1. CUADRO DE ACTIVIDADES</w:t>
-      </w:r>
-    </w:p>
-    <w:p>
-      <w:pPr>
-        <w:pStyle w:val="Tesis"/>
-      </w:pPr>
-      <w:r>
-        <w:t xml:space="preserve">Barón y Moraga (2013), afirman que dentro de un proceso de software una actividad </w:t>
-      </w:r>
-      <w:r>
-        <w:t>una actividad es un conjunto de acciones relacionadas que se llevan a cabo para lograr un objetivo específico dentro de una fase (como requisitos, diseño o pruebas). Produce o modifica un artefacto (documento, código) y sigue un procedimiento definido.</w:t>
-      </w:r>
-      <w:r>
-        <w:t xml:space="preserve"> Con esta definición en mente, a continuación, se presenta el cuadro de actividades donde se indican las actividades que se llevan a cabo para alcanzar los objetivos que fueron establecidos al principio de esta investigación. Ahí se detallan las fases de la metodología seleccionada y los recursos utilizados para la ejecución de cada una de esas actividades.</w:t>
-      </w:r>
-    </w:p>
-    <w:p>
-      <w:pPr>
-        <w:pStyle w:val="Tesis"/>
-      </w:pPr>
-    </w:p>
-    <w:p>
-      <w:pPr>
-        <w:spacing w:after="0" w:line="240" w:lineRule="auto"/>
-        <w:jc w:val="center"/>
+        <w:t>5</w:t>
+      </w:r>
+      <w:r>
         <w:rPr>
           <w:rFonts w:ascii="Arial" w:hAnsi="Arial" w:cs="Arial"/>
           <w:b/>
@@ -2059,6 +2113,37 @@
           <w:sz w:val="24"/>
           <w:szCs w:val="24"/>
         </w:rPr>
+        <w:t>.1. CUADRO DE ACTIVIDADES</w:t>
+      </w:r>
+    </w:p>
+    <w:p>
+      <w:pPr>
+        <w:pStyle w:val="Tesis"/>
+      </w:pPr>
+      <w:r>
+        <w:t xml:space="preserve">Barón y Moraga (2013), afirman que dentro de un proceso de software una actividad </w:t>
+      </w:r>
+      <w:r>
+        <w:t>una actividad es un conjunto de acciones relacionadas que se llevan a cabo para lograr un objetivo específico dentro de una fase (como requisitos, diseño o pruebas). Produce o modifica un artefacto (documento, código) y sigue un procedimiento definido.</w:t>
+      </w:r>
+      <w:r>
+        <w:t xml:space="preserve"> Con esta definición en mente, a continuación, se presenta el cuadro de actividades donde se indican las actividades que se llevan a cabo para alcanzar los objetivos que fueron establecidos al principio de esta investigación. Ahí se detallan las fases de la metodología seleccionada y los recursos utilizados para la ejecución de cada una de esas actividades.</w:t>
+      </w:r>
+    </w:p>
+    <w:p>
+      <w:pPr>
+        <w:pStyle w:val="Tesis"/>
+      </w:pPr>
+    </w:p>
+    <w:p>
+      <w:pPr>
+        <w:spacing w:after="0" w:line="240" w:lineRule="auto"/>
+        <w:jc w:val="center"/>
+        <w:rPr>
+          <w:rFonts w:ascii="Arial" w:hAnsi="Arial" w:cs="Arial"/>
+          <w:sz w:val="24"/>
+          <w:szCs w:val="24"/>
+        </w:rPr>
       </w:pPr>
       <w:r>
         <w:rPr>
@@ -2079,13 +2164,9 @@
           <w:sz w:val="24"/>
           <w:szCs w:val="24"/>
         </w:rPr>
-        <w:t>2</w:t>
-      </w:r>
-    </w:p>
-    <w:p>
-      <w:pPr>
-        <w:spacing w:after="0" w:line="240" w:lineRule="auto"/>
-        <w:jc w:val="center"/>
+        <w:t>N°</w:t>
+      </w:r>
+      <w:r>
         <w:rPr>
           <w:rFonts w:ascii="Arial" w:hAnsi="Arial" w:cs="Arial"/>
           <w:b/>
@@ -2093,12 +2174,21 @@
           <w:sz w:val="24"/>
           <w:szCs w:val="24"/>
         </w:rPr>
-      </w:pPr>
+        <w:t>2</w:t>
+      </w:r>
       <w:r>
         <w:rPr>
           <w:rFonts w:ascii="Arial" w:hAnsi="Arial" w:cs="Arial"/>
           <w:b/>
           <w:bCs/>
+          <w:sz w:val="24"/>
+          <w:szCs w:val="24"/>
+        </w:rPr>
+        <w:t xml:space="preserve">. </w:t>
+      </w:r>
+      <w:r>
+        <w:rPr>
+          <w:rFonts w:ascii="Arial" w:hAnsi="Arial" w:cs="Arial"/>
           <w:sz w:val="24"/>
           <w:szCs w:val="24"/>
         </w:rPr>
@@ -3067,7 +3157,27 @@
           <w:szCs w:val="24"/>
         </w:rPr>
         <w:lastRenderedPageBreak/>
-        <w:t>CUADRO 2</w:t>
+        <w:t xml:space="preserve">CUADRO </w:t>
+      </w:r>
+      <w:r>
+        <w:rPr>
+          <w:rFonts w:ascii="Arial" w:hAnsi="Arial" w:cs="Arial"/>
+          <w:b/>
+          <w:bCs/>
+          <w:sz w:val="24"/>
+          <w:szCs w:val="24"/>
+        </w:rPr>
+        <w:t>N°</w:t>
+      </w:r>
+      <w:r>
+        <w:rPr>
+          <w:rFonts w:ascii="Arial" w:hAnsi="Arial" w:cs="Arial"/>
+          <w:b/>
+          <w:bCs/>
+          <w:sz w:val="24"/>
+          <w:szCs w:val="24"/>
+        </w:rPr>
+        <w:t>2</w:t>
       </w:r>
     </w:p>
     <w:p>
@@ -3693,78 +3803,8 @@
           <w:sz w:val="24"/>
           <w:szCs w:val="24"/>
         </w:rPr>
-        <w:t xml:space="preserve">Fuente: </w:t>
-      </w:r>
-      <w:r>
-        <w:rPr>
-          <w:rFonts w:ascii="Arial" w:hAnsi="Arial" w:cs="Arial"/>
-          <w:sz w:val="24"/>
-          <w:szCs w:val="24"/>
-        </w:rPr>
-        <w:t xml:space="preserve">Araujo, Montiel, </w:t>
-      </w:r>
-      <w:proofErr w:type="spellStart"/>
-      <w:r>
-        <w:rPr>
-          <w:rFonts w:ascii="Arial" w:hAnsi="Arial" w:cs="Arial"/>
-          <w:sz w:val="24"/>
-          <w:szCs w:val="24"/>
-        </w:rPr>
-        <w:t>Acurero</w:t>
-      </w:r>
-      <w:proofErr w:type="spellEnd"/>
-      <w:r>
-        <w:rPr>
-          <w:rFonts w:ascii="Arial" w:hAnsi="Arial" w:cs="Arial"/>
-          <w:sz w:val="24"/>
-          <w:szCs w:val="24"/>
-        </w:rPr>
-        <w:t xml:space="preserve"> (202</w:t>
-      </w:r>
-      <w:r>
-        <w:rPr>
-          <w:rFonts w:ascii="Arial" w:hAnsi="Arial" w:cs="Arial"/>
-          <w:sz w:val="24"/>
-          <w:szCs w:val="24"/>
-        </w:rPr>
-        <w:t>5</w:t>
-      </w:r>
-      <w:r>
-        <w:rPr>
-          <w:rFonts w:ascii="Arial" w:hAnsi="Arial" w:cs="Arial"/>
-          <w:sz w:val="24"/>
-          <w:szCs w:val="24"/>
-        </w:rPr>
-        <w:t>)</w:t>
-      </w:r>
-      <w:r>
-        <w:rPr>
-          <w:rFonts w:ascii="Arial" w:hAnsi="Arial" w:cs="Arial"/>
-          <w:sz w:val="24"/>
-          <w:szCs w:val="24"/>
-        </w:rPr>
-        <w:t>.</w:t>
-      </w:r>
-    </w:p>
-    <w:p>
-      <w:pPr>
-        <w:spacing w:line="240" w:lineRule="auto"/>
-        <w:rPr>
-          <w:rFonts w:ascii="Arial" w:hAnsi="Arial" w:cs="Arial"/>
-          <w:sz w:val="24"/>
-          <w:szCs w:val="24"/>
-        </w:rPr>
-      </w:pPr>
-    </w:p>
-    <w:p>
-      <w:pPr>
-        <w:spacing w:line="240" w:lineRule="auto"/>
-        <w:rPr>
-          <w:rFonts w:ascii="Arial" w:hAnsi="Arial" w:cs="Arial"/>
-          <w:sz w:val="24"/>
-          <w:szCs w:val="24"/>
-        </w:rPr>
-      </w:pPr>
+        <w:t>Fuente:</w:t>
+      </w:r>
       <w:r>
         <w:rPr>
           <w:rFonts w:ascii="Arial" w:hAnsi="Arial" w:cs="Arial"/>
@@ -3773,8 +3813,78 @@
           <w:sz w:val="24"/>
           <w:szCs w:val="24"/>
         </w:rPr>
+        <w:t xml:space="preserve"> </w:t>
+      </w:r>
+      <w:proofErr w:type="spellStart"/>
+      <w:r>
+        <w:rPr>
+          <w:rFonts w:ascii="Arial" w:hAnsi="Arial" w:cs="Arial"/>
+          <w:sz w:val="24"/>
+          <w:szCs w:val="24"/>
+        </w:rPr>
+        <w:t>Acurero</w:t>
+      </w:r>
+      <w:proofErr w:type="spellEnd"/>
+      <w:r>
+        <w:rPr>
+          <w:rFonts w:ascii="Arial" w:hAnsi="Arial" w:cs="Arial"/>
+          <w:sz w:val="24"/>
+          <w:szCs w:val="24"/>
+        </w:rPr>
+        <w:t xml:space="preserve">, Araujo, Montiel </w:t>
+      </w:r>
+      <w:r>
+        <w:rPr>
+          <w:rFonts w:ascii="Arial" w:hAnsi="Arial" w:cs="Arial"/>
+          <w:sz w:val="24"/>
+          <w:szCs w:val="24"/>
+        </w:rPr>
+        <w:t>(202</w:t>
+      </w:r>
+      <w:r>
+        <w:rPr>
+          <w:rFonts w:ascii="Arial" w:hAnsi="Arial" w:cs="Arial"/>
+          <w:sz w:val="24"/>
+          <w:szCs w:val="24"/>
+        </w:rPr>
         <w:t>5</w:t>
       </w:r>
+      <w:r>
+        <w:rPr>
+          <w:rFonts w:ascii="Arial" w:hAnsi="Arial" w:cs="Arial"/>
+          <w:sz w:val="24"/>
+          <w:szCs w:val="24"/>
+        </w:rPr>
+        <w:t>)</w:t>
+      </w:r>
+      <w:r>
+        <w:rPr>
+          <w:rFonts w:ascii="Arial" w:hAnsi="Arial" w:cs="Arial"/>
+          <w:sz w:val="24"/>
+          <w:szCs w:val="24"/>
+        </w:rPr>
+        <w:t>.</w:t>
+      </w:r>
+    </w:p>
+    <w:p>
+      <w:pPr>
+        <w:spacing w:line="240" w:lineRule="auto"/>
+        <w:rPr>
+          <w:rFonts w:ascii="Arial" w:hAnsi="Arial" w:cs="Arial"/>
+          <w:sz w:val="24"/>
+          <w:szCs w:val="24"/>
+        </w:rPr>
+      </w:pPr>
+    </w:p>
+    <w:p>
+      <w:pPr>
+        <w:spacing w:line="240" w:lineRule="auto"/>
+        <w:rPr>
+          <w:rFonts w:ascii="Arial" w:hAnsi="Arial" w:cs="Arial"/>
+          <w:sz w:val="24"/>
+          <w:szCs w:val="24"/>
+        </w:rPr>
+      </w:pPr>
       <w:r>
         <w:rPr>
           <w:rFonts w:ascii="Arial" w:hAnsi="Arial" w:cs="Arial"/>
@@ -3783,6 +3893,16 @@
           <w:sz w:val="24"/>
           <w:szCs w:val="24"/>
         </w:rPr>
+        <w:t>5</w:t>
+      </w:r>
+      <w:r>
+        <w:rPr>
+          <w:rFonts w:ascii="Arial" w:hAnsi="Arial" w:cs="Arial"/>
+          <w:b/>
+          <w:bCs/>
+          <w:sz w:val="24"/>
+          <w:szCs w:val="24"/>
+        </w:rPr>
         <w:t>.2 CRONOGRAMA DE ACTIVIDADES</w:t>
       </w:r>
     </w:p>
@@ -3790,6 +3910,8 @@
       <w:pPr>
         <w:pStyle w:val="Tesis"/>
         <w:sectPr>
+          <w:headerReference w:type="default" r:id="rId17"/>
+          <w:footerReference w:type="default" r:id="rId18"/>
           <w:pgSz w:w="12240" w:h="15840"/>
           <w:pgMar w:top="1701" w:right="1701" w:bottom="1701" w:left="2268" w:header="709" w:footer="709" w:gutter="0"/>
           <w:cols w:space="708"/>
@@ -3803,7 +3925,10 @@
         <w:t>es la parte del proyecto en donde se fijan los tiempos y el orden en que deben realizarse las actividades. Se representa gráficamente, generalmente en forma de diagrama de Gantt, y es fundamental para la planificación, asignación de recursos y control del avance del proyecto.</w:t>
       </w:r>
       <w:r>
-        <w:t xml:space="preserve"> Por lo tanto, el cronograma de actividades es una herramienta a través de la cual representa el inicio, ejecución y finalización de un conjunto de actividades a lo largo de un periodo de tiempo.</w:t>
+        <w:t xml:space="preserve"> Por lo tanto, el cronograma de actividades es una herramienta a través de la cual representa el inicio, ejecución y finalización de un conjunto de actividades a lo largo de un periodo de tiempo</w:t>
+      </w:r>
+      <w:r>
+        <w:t>.</w:t>
       </w:r>
     </w:p>
     <w:p>
@@ -3827,13 +3952,9 @@
           <w:szCs w:val="24"/>
         </w:rPr>
         <w:lastRenderedPageBreak/>
-        <w:t>CUADRO 3</w:t>
-      </w:r>
-    </w:p>
-    <w:p>
-      <w:pPr>
-        <w:spacing w:after="0" w:line="240" w:lineRule="auto"/>
-        <w:jc w:val="center"/>
+        <w:t xml:space="preserve">CUADRO </w:t>
+      </w:r>
+      <w:r>
         <w:rPr>
           <w:rFonts w:ascii="Arial" w:hAnsi="Arial" w:cs="Arial"/>
           <w:b/>
@@ -3841,12 +3962,31 @@
           <w:sz w:val="24"/>
           <w:szCs w:val="24"/>
         </w:rPr>
-      </w:pPr>
+        <w:t>N°</w:t>
+      </w:r>
       <w:r>
         <w:rPr>
           <w:rFonts w:ascii="Arial" w:hAnsi="Arial" w:cs="Arial"/>
           <w:b/>
           <w:bCs/>
+          <w:sz w:val="24"/>
+          <w:szCs w:val="24"/>
+        </w:rPr>
+        <w:t>3</w:t>
+      </w:r>
+      <w:r>
+        <w:rPr>
+          <w:rFonts w:ascii="Arial" w:hAnsi="Arial" w:cs="Arial"/>
+          <w:b/>
+          <w:bCs/>
+          <w:sz w:val="24"/>
+          <w:szCs w:val="24"/>
+        </w:rPr>
+        <w:t xml:space="preserve">. </w:t>
+      </w:r>
+      <w:r>
+        <w:rPr>
+          <w:rFonts w:ascii="Arial" w:hAnsi="Arial" w:cs="Arial"/>
           <w:sz w:val="24"/>
           <w:szCs w:val="24"/>
         </w:rPr>
@@ -7806,7 +7946,6 @@
     <w:p>
       <w:pPr>
         <w:spacing w:after="0" w:line="240" w:lineRule="auto"/>
-        <w:jc w:val="center"/>
         <w:rPr>
           <w:rFonts w:ascii="Arial" w:hAnsi="Arial" w:cs="Arial"/>
           <w:b/>
@@ -7815,7 +7954,11 @@
           <w:szCs w:val="24"/>
         </w:rPr>
       </w:pPr>
-      <w:r>
+    </w:p>
+    <w:p>
+      <w:pPr>
+        <w:spacing w:after="0" w:line="240" w:lineRule="auto"/>
+        <w:jc w:val="center"/>
         <w:rPr>
           <w:rFonts w:ascii="Arial" w:hAnsi="Arial" w:cs="Arial"/>
           <w:b/>
@@ -7823,8 +7966,37 @@
           <w:sz w:val="24"/>
           <w:szCs w:val="24"/>
         </w:rPr>
+      </w:pPr>
+      <w:r>
+        <w:rPr>
+          <w:rFonts w:ascii="Arial" w:hAnsi="Arial" w:cs="Arial"/>
+          <w:b/>
+          <w:bCs/>
+          <w:sz w:val="24"/>
+          <w:szCs w:val="24"/>
+        </w:rPr>
         <w:lastRenderedPageBreak/>
-        <w:t>CUADRO 3</w:t>
+        <w:t xml:space="preserve">CUADRO </w:t>
+      </w:r>
+      <w:r>
+        <w:rPr>
+          <w:rFonts w:ascii="Arial" w:hAnsi="Arial" w:cs="Arial"/>
+          <w:b/>
+          <w:bCs/>
+          <w:sz w:val="24"/>
+          <w:szCs w:val="24"/>
+        </w:rPr>
+        <w:t>N°</w:t>
+      </w:r>
+      <w:r>
+        <w:rPr>
+          <w:rFonts w:ascii="Arial" w:hAnsi="Arial" w:cs="Arial"/>
+          <w:b/>
+          <w:bCs/>
+          <w:sz w:val="24"/>
+          <w:szCs w:val="24"/>
+        </w:rPr>
+        <w:t>3</w:t>
       </w:r>
     </w:p>
     <w:p>
@@ -12441,13 +12613,31 @@
         </w:rPr>
         <w:t xml:space="preserve">Fuente: </w:t>
       </w:r>
+      <w:proofErr w:type="spellStart"/>
       <w:r>
         <w:rPr>
           <w:rFonts w:ascii="Arial" w:hAnsi="Arial" w:cs="Arial"/>
           <w:sz w:val="24"/>
           <w:szCs w:val="24"/>
         </w:rPr>
-        <w:t>Araujo, Montiel, Cesar (</w:t>
+        <w:t>Acurero</w:t>
+      </w:r>
+      <w:proofErr w:type="spellEnd"/>
+      <w:r>
+        <w:rPr>
+          <w:rFonts w:ascii="Arial" w:hAnsi="Arial" w:cs="Arial"/>
+          <w:sz w:val="24"/>
+          <w:szCs w:val="24"/>
+        </w:rPr>
+        <w:t xml:space="preserve">, </w:t>
+      </w:r>
+      <w:r>
+        <w:rPr>
+          <w:rFonts w:ascii="Arial" w:hAnsi="Arial" w:cs="Arial"/>
+          <w:sz w:val="24"/>
+          <w:szCs w:val="24"/>
+        </w:rPr>
+        <w:t>Araujo, Montiel (</w:t>
       </w:r>
       <w:r>
         <w:rPr>
@@ -12493,6 +12683,124 @@
 </w:endnotes>
 </file>
 
+<file path=word/footer1.xml><?xml version="1.0" encoding="utf-8"?>
+<w:ftr xmlns:wpc="http://schemas.microsoft.com/office/word/2010/wordprocessingCanvas" xmlns:cx="http://schemas.microsoft.com/office/drawing/2014/chartex" xmlns:cx1="http://schemas.microsoft.com/office/drawing/2015/9/8/chartex" xmlns:cx2="http://schemas.microsoft.com/office/drawing/2015/10/21/chartex" xmlns:cx3="http://schemas.microsoft.com/office/drawing/2016/5/9/chartex" xmlns:cx4="http://schemas.microsoft.com/office/drawing/2016/5/10/chartex" xmlns:cx5="http://schemas.microsoft.com/office/drawing/2016/5/11/chartex" xmlns:cx6="http://schemas.microsoft.com/office/drawing/2016/5/12/chartex" xmlns:cx7="http://schemas.microsoft.com/office/drawing/2016/5/13/chartex" xmlns:cx8="http://schemas.microsoft.com/office/drawing/2016/5/14/chartex" xmlns:mc="http://schemas.openxmlformats.org/markup-compatibility/2006" xmlns:aink="http://schemas.microsoft.com/office/drawing/2016/ink" xmlns:am3d="http://schemas.microsoft.com/office/drawing/2017/model3d" xmlns:o="urn:schemas-microsoft-com:office:office" xmlns:oel="http://schemas.microsoft.com/office/2019/extlst" xmlns:r="http://schemas.openxmlformats.org/officeDocument/2006/relationships" xmlns:m="http://schemas.openxmlformats.org/officeDocument/2006/math" xmlns:v="urn:schemas-microsoft-com:vml" xmlns:wp14="http://schemas.microsoft.com/office/word/2010/wordprocessingDrawing" xmlns:wp="http://schemas.openxmlformats.org/drawingml/2006/wordprocessingDrawing" xmlns:w10="urn:schemas-microsoft-com:office:word" xmlns:w="http://schemas.openxmlformats.org/wordprocessingml/2006/main" xmlns:w14="http://schemas.microsoft.com/office/word/2010/wordml" xmlns:w15="http://schemas.microsoft.com/office/word/2012/wordml" xmlns:w16cex="http://schemas.microsoft.com/office/word/2018/wordml/cex" xmlns:w16cid="http://schemas.microsoft.com/office/word/2016/wordml/cid" xmlns:w16="http://schemas.microsoft.com/office/word/2018/wordml" xmlns:w16sdtdh="http://schemas.microsoft.com/office/word/2020/wordml/sdtdatahash" xmlns:w16se="http://schemas.microsoft.com/office/word/2015/wordml/symex" xmlns:wpg="http://schemas.microsoft.com/office/word/2010/wordprocessingGroup" xmlns:wpi="http://schemas.microsoft.com/office/word/2010/wordprocessingInk" xmlns:wne="http://schemas.microsoft.com/office/word/2006/wordml" xmlns:wps="http://schemas.microsoft.com/office/word/2010/wordprocessingShape" mc:Ignorable="w14 w15 w16se w16cid w16 w16cex w16sdtdh wp14">
+  <w:p>
+    <w:pPr>
+      <w:pStyle w:val="Piedepgina"/>
+    </w:pPr>
+  </w:p>
+</w:ftr>
+</file>
+
+<file path=word/footer2.xml><?xml version="1.0" encoding="utf-8"?>
+<w:ftr xmlns:wpc="http://schemas.microsoft.com/office/word/2010/wordprocessingCanvas" xmlns:cx="http://schemas.microsoft.com/office/drawing/2014/chartex" xmlns:cx1="http://schemas.microsoft.com/office/drawing/2015/9/8/chartex" xmlns:cx2="http://schemas.microsoft.com/office/drawing/2015/10/21/chartex" xmlns:cx3="http://schemas.microsoft.com/office/drawing/2016/5/9/chartex" xmlns:cx4="http://schemas.microsoft.com/office/drawing/2016/5/10/chartex" xmlns:cx5="http://schemas.microsoft.com/office/drawing/2016/5/11/chartex" xmlns:cx6="http://schemas.microsoft.com/office/drawing/2016/5/12/chartex" xmlns:cx7="http://schemas.microsoft.com/office/drawing/2016/5/13/chartex" xmlns:cx8="http://schemas.microsoft.com/office/drawing/2016/5/14/chartex" xmlns:mc="http://schemas.openxmlformats.org/markup-compatibility/2006" xmlns:aink="http://schemas.microsoft.com/office/drawing/2016/ink" xmlns:am3d="http://schemas.microsoft.com/office/drawing/2017/model3d" xmlns:o="urn:schemas-microsoft-com:office:office" xmlns:oel="http://schemas.microsoft.com/office/2019/extlst" xmlns:r="http://schemas.openxmlformats.org/officeDocument/2006/relationships" xmlns:m="http://schemas.openxmlformats.org/officeDocument/2006/math" xmlns:v="urn:schemas-microsoft-com:vml" xmlns:wp14="http://schemas.microsoft.com/office/word/2010/wordprocessingDrawing" xmlns:wp="http://schemas.openxmlformats.org/drawingml/2006/wordprocessingDrawing" xmlns:w10="urn:schemas-microsoft-com:office:word" xmlns:w="http://schemas.openxmlformats.org/wordprocessingml/2006/main" xmlns:w14="http://schemas.microsoft.com/office/word/2010/wordml" xmlns:w15="http://schemas.microsoft.com/office/word/2012/wordml" xmlns:w16cex="http://schemas.microsoft.com/office/word/2018/wordml/cex" xmlns:w16cid="http://schemas.microsoft.com/office/word/2016/wordml/cid" xmlns:w16="http://schemas.microsoft.com/office/word/2018/wordml" xmlns:w16sdtdh="http://schemas.microsoft.com/office/word/2020/wordml/sdtdatahash" xmlns:w16se="http://schemas.microsoft.com/office/word/2015/wordml/symex" xmlns:wpg="http://schemas.microsoft.com/office/word/2010/wordprocessingGroup" xmlns:wpi="http://schemas.microsoft.com/office/word/2010/wordprocessingInk" xmlns:wne="http://schemas.microsoft.com/office/word/2006/wordml" xmlns:wps="http://schemas.microsoft.com/office/word/2010/wordprocessingShape" mc:Ignorable="w14 w15 w16se w16cid w16 w16cex w16sdtdh wp14">
+  <w:p>
+    <w:pPr>
+      <w:pStyle w:val="Piedepgina"/>
+    </w:pPr>
+  </w:p>
+</w:ftr>
+</file>
+
+<file path=word/footer3.xml><?xml version="1.0" encoding="utf-8"?>
+<w:ftr xmlns:wpc="http://schemas.microsoft.com/office/word/2010/wordprocessingCanvas" xmlns:cx="http://schemas.microsoft.com/office/drawing/2014/chartex" xmlns:cx1="http://schemas.microsoft.com/office/drawing/2015/9/8/chartex" xmlns:cx2="http://schemas.microsoft.com/office/drawing/2015/10/21/chartex" xmlns:cx3="http://schemas.microsoft.com/office/drawing/2016/5/9/chartex" xmlns:cx4="http://schemas.microsoft.com/office/drawing/2016/5/10/chartex" xmlns:cx5="http://schemas.microsoft.com/office/drawing/2016/5/11/chartex" xmlns:cx6="http://schemas.microsoft.com/office/drawing/2016/5/12/chartex" xmlns:cx7="http://schemas.microsoft.com/office/drawing/2016/5/13/chartex" xmlns:cx8="http://schemas.microsoft.com/office/drawing/2016/5/14/chartex" xmlns:mc="http://schemas.openxmlformats.org/markup-compatibility/2006" xmlns:aink="http://schemas.microsoft.com/office/drawing/2016/ink" xmlns:am3d="http://schemas.microsoft.com/office/drawing/2017/model3d" xmlns:o="urn:schemas-microsoft-com:office:office" xmlns:oel="http://schemas.microsoft.com/office/2019/extlst" xmlns:r="http://schemas.openxmlformats.org/officeDocument/2006/relationships" xmlns:m="http://schemas.openxmlformats.org/officeDocument/2006/math" xmlns:v="urn:schemas-microsoft-com:vml" xmlns:wp14="http://schemas.microsoft.com/office/word/2010/wordprocessingDrawing" xmlns:wp="http://schemas.openxmlformats.org/drawingml/2006/wordprocessingDrawing" xmlns:w10="urn:schemas-microsoft-com:office:word" xmlns:w="http://schemas.openxmlformats.org/wordprocessingml/2006/main" xmlns:w14="http://schemas.microsoft.com/office/word/2010/wordml" xmlns:w15="http://schemas.microsoft.com/office/word/2012/wordml" xmlns:w16cex="http://schemas.microsoft.com/office/word/2018/wordml/cex" xmlns:w16cid="http://schemas.microsoft.com/office/word/2016/wordml/cid" xmlns:w16="http://schemas.microsoft.com/office/word/2018/wordml" xmlns:w16sdtdh="http://schemas.microsoft.com/office/word/2020/wordml/sdtdatahash" xmlns:w16se="http://schemas.microsoft.com/office/word/2015/wordml/symex" xmlns:wpg="http://schemas.microsoft.com/office/word/2010/wordprocessingGroup" xmlns:wpi="http://schemas.microsoft.com/office/word/2010/wordprocessingInk" xmlns:wne="http://schemas.microsoft.com/office/word/2006/wordml" xmlns:wps="http://schemas.microsoft.com/office/word/2010/wordprocessingShape" mc:Ignorable="w14 w15 w16se w16cid w16 w16cex w16sdtdh wp14">
+  <w:p>
+    <w:pPr>
+      <w:pStyle w:val="Piedepgina"/>
+    </w:pPr>
+  </w:p>
+</w:ftr>
+</file>
+
+<file path=word/footer4.xml><?xml version="1.0" encoding="utf-8"?>
+<w:ftr xmlns:wpc="http://schemas.microsoft.com/office/word/2010/wordprocessingCanvas" xmlns:cx="http://schemas.microsoft.com/office/drawing/2014/chartex" xmlns:cx1="http://schemas.microsoft.com/office/drawing/2015/9/8/chartex" xmlns:cx2="http://schemas.microsoft.com/office/drawing/2015/10/21/chartex" xmlns:cx3="http://schemas.microsoft.com/office/drawing/2016/5/9/chartex" xmlns:cx4="http://schemas.microsoft.com/office/drawing/2016/5/10/chartex" xmlns:cx5="http://schemas.microsoft.com/office/drawing/2016/5/11/chartex" xmlns:cx6="http://schemas.microsoft.com/office/drawing/2016/5/12/chartex" xmlns:cx7="http://schemas.microsoft.com/office/drawing/2016/5/13/chartex" xmlns:cx8="http://schemas.microsoft.com/office/drawing/2016/5/14/chartex" xmlns:mc="http://schemas.openxmlformats.org/markup-compatibility/2006" xmlns:aink="http://schemas.microsoft.com/office/drawing/2016/ink" xmlns:am3d="http://schemas.microsoft.com/office/drawing/2017/model3d" xmlns:o="urn:schemas-microsoft-com:office:office" xmlns:oel="http://schemas.microsoft.com/office/2019/extlst" xmlns:r="http://schemas.openxmlformats.org/officeDocument/2006/relationships" xmlns:m="http://schemas.openxmlformats.org/officeDocument/2006/math" xmlns:v="urn:schemas-microsoft-com:vml" xmlns:wp14="http://schemas.microsoft.com/office/word/2010/wordprocessingDrawing" xmlns:wp="http://schemas.openxmlformats.org/drawingml/2006/wordprocessingDrawing" xmlns:w10="urn:schemas-microsoft-com:office:word" xmlns:w="http://schemas.openxmlformats.org/wordprocessingml/2006/main" xmlns:w14="http://schemas.microsoft.com/office/word/2010/wordml" xmlns:w15="http://schemas.microsoft.com/office/word/2012/wordml" xmlns:w16cex="http://schemas.microsoft.com/office/word/2018/wordml/cex" xmlns:w16cid="http://schemas.microsoft.com/office/word/2016/wordml/cid" xmlns:w16="http://schemas.microsoft.com/office/word/2018/wordml" xmlns:w16sdtdh="http://schemas.microsoft.com/office/word/2020/wordml/sdtdatahash" xmlns:w16se="http://schemas.microsoft.com/office/word/2015/wordml/symex" xmlns:wpg="http://schemas.microsoft.com/office/word/2010/wordprocessingGroup" xmlns:wpi="http://schemas.microsoft.com/office/word/2010/wordprocessingInk" xmlns:wne="http://schemas.microsoft.com/office/word/2006/wordml" xmlns:wps="http://schemas.microsoft.com/office/word/2010/wordprocessingShape" mc:Ignorable="w14 w15 w16se w16cid w16 w16cex w16sdtdh wp14">
+  <w:sdt>
+    <w:sdtPr>
+      <w:rPr>
+        <w:rFonts w:ascii="Arial" w:hAnsi="Arial" w:cs="Arial"/>
+        <w:sz w:val="24"/>
+        <w:szCs w:val="24"/>
+      </w:rPr>
+      <w:id w:val="704297719"/>
+      <w:docPartObj>
+        <w:docPartGallery w:val="Page Numbers (Bottom of Page)"/>
+        <w:docPartUnique/>
+      </w:docPartObj>
+    </w:sdtPr>
+    <w:sdtContent>
+      <w:p>
+        <w:pPr>
+          <w:pStyle w:val="Piedepgina"/>
+          <w:jc w:val="center"/>
+          <w:rPr>
+            <w:rFonts w:ascii="Arial" w:hAnsi="Arial" w:cs="Arial"/>
+            <w:sz w:val="24"/>
+            <w:szCs w:val="24"/>
+          </w:rPr>
+        </w:pPr>
+        <w:r>
+          <w:rPr>
+            <w:rFonts w:ascii="Arial" w:hAnsi="Arial" w:cs="Arial"/>
+            <w:sz w:val="24"/>
+            <w:szCs w:val="24"/>
+          </w:rPr>
+          <w:fldChar w:fldCharType="begin"/>
+        </w:r>
+        <w:r>
+          <w:rPr>
+            <w:rFonts w:ascii="Arial" w:hAnsi="Arial" w:cs="Arial"/>
+            <w:sz w:val="24"/>
+            <w:szCs w:val="24"/>
+          </w:rPr>
+          <w:instrText>PAGE   \* MERGEFORMAT</w:instrText>
+        </w:r>
+        <w:r>
+          <w:rPr>
+            <w:rFonts w:ascii="Arial" w:hAnsi="Arial" w:cs="Arial"/>
+            <w:sz w:val="24"/>
+            <w:szCs w:val="24"/>
+          </w:rPr>
+          <w:fldChar w:fldCharType="separate"/>
+        </w:r>
+        <w:r>
+          <w:rPr>
+            <w:rFonts w:ascii="Arial" w:hAnsi="Arial" w:cs="Arial"/>
+            <w:sz w:val="24"/>
+            <w:szCs w:val="24"/>
+            <w:lang w:val="es-ES"/>
+          </w:rPr>
+          <w:t>2</w:t>
+        </w:r>
+        <w:r>
+          <w:rPr>
+            <w:rFonts w:ascii="Arial" w:hAnsi="Arial" w:cs="Arial"/>
+            <w:sz w:val="24"/>
+            <w:szCs w:val="24"/>
+          </w:rPr>
+          <w:fldChar w:fldCharType="end"/>
+        </w:r>
+      </w:p>
+    </w:sdtContent>
+  </w:sdt>
+  <w:p>
+    <w:pPr>
+      <w:pStyle w:val="Piedepgina"/>
+    </w:pPr>
+  </w:p>
+</w:ftr>
+</file>
+
+<file path=word/footer5.xml><?xml version="1.0" encoding="utf-8"?>
+<w:ftr xmlns:wpc="http://schemas.microsoft.com/office/word/2010/wordprocessingCanvas" xmlns:cx="http://schemas.microsoft.com/office/drawing/2014/chartex" xmlns:cx1="http://schemas.microsoft.com/office/drawing/2015/9/8/chartex" xmlns:cx2="http://schemas.microsoft.com/office/drawing/2015/10/21/chartex" xmlns:cx3="http://schemas.microsoft.com/office/drawing/2016/5/9/chartex" xmlns:cx4="http://schemas.microsoft.com/office/drawing/2016/5/10/chartex" xmlns:cx5="http://schemas.microsoft.com/office/drawing/2016/5/11/chartex" xmlns:cx6="http://schemas.microsoft.com/office/drawing/2016/5/12/chartex" xmlns:cx7="http://schemas.microsoft.com/office/drawing/2016/5/13/chartex" xmlns:cx8="http://schemas.microsoft.com/office/drawing/2016/5/14/chartex" xmlns:mc="http://schemas.openxmlformats.org/markup-compatibility/2006" xmlns:aink="http://schemas.microsoft.com/office/drawing/2016/ink" xmlns:am3d="http://schemas.microsoft.com/office/drawing/2017/model3d" xmlns:o="urn:schemas-microsoft-com:office:office" xmlns:oel="http://schemas.microsoft.com/office/2019/extlst" xmlns:r="http://schemas.openxmlformats.org/officeDocument/2006/relationships" xmlns:m="http://schemas.openxmlformats.org/officeDocument/2006/math" xmlns:v="urn:schemas-microsoft-com:vml" xmlns:wp14="http://schemas.microsoft.com/office/word/2010/wordprocessingDrawing" xmlns:wp="http://schemas.openxmlformats.org/drawingml/2006/wordprocessingDrawing" xmlns:w10="urn:schemas-microsoft-com:office:word" xmlns:w="http://schemas.openxmlformats.org/wordprocessingml/2006/main" xmlns:w14="http://schemas.microsoft.com/office/word/2010/wordml" xmlns:w15="http://schemas.microsoft.com/office/word/2012/wordml" xmlns:w16cex="http://schemas.microsoft.com/office/word/2018/wordml/cex" xmlns:w16cid="http://schemas.microsoft.com/office/word/2016/wordml/cid" xmlns:w16="http://schemas.microsoft.com/office/word/2018/wordml" xmlns:w16sdtdh="http://schemas.microsoft.com/office/word/2020/wordml/sdtdatahash" xmlns:w16se="http://schemas.microsoft.com/office/word/2015/wordml/symex" xmlns:wpg="http://schemas.microsoft.com/office/word/2010/wordprocessingGroup" xmlns:wpi="http://schemas.microsoft.com/office/word/2010/wordprocessingInk" xmlns:wne="http://schemas.microsoft.com/office/word/2006/wordml" xmlns:wps="http://schemas.microsoft.com/office/word/2010/wordprocessingShape" mc:Ignorable="w14 w15 w16se w16cid w16 w16cex w16sdtdh wp14">
+  <w:p>
+    <w:pPr>
+      <w:pStyle w:val="Piedepgina"/>
+    </w:pPr>
+  </w:p>
+</w:ftr>
+</file>
+
 <file path=word/footnotes.xml><?xml version="1.0" encoding="utf-8"?>
 <w:footnotes xmlns:wpc="http://schemas.microsoft.com/office/word/2010/wordprocessingCanvas" xmlns:cx="http://schemas.microsoft.com/office/drawing/2014/chartex" xmlns:cx1="http://schemas.microsoft.com/office/drawing/2015/9/8/chartex" xmlns:cx2="http://schemas.microsoft.com/office/drawing/2015/10/21/chartex" xmlns:cx3="http://schemas.microsoft.com/office/drawing/2016/5/9/chartex" xmlns:cx4="http://schemas.microsoft.com/office/drawing/2016/5/10/chartex" xmlns:cx5="http://schemas.microsoft.com/office/drawing/2016/5/11/chartex" xmlns:cx6="http://schemas.microsoft.com/office/drawing/2016/5/12/chartex" xmlns:cx7="http://schemas.microsoft.com/office/drawing/2016/5/13/chartex" xmlns:cx8="http://schemas.microsoft.com/office/drawing/2016/5/14/chartex" xmlns:mc="http://schemas.openxmlformats.org/markup-compatibility/2006" xmlns:aink="http://schemas.microsoft.com/office/drawing/2016/ink" xmlns:am3d="http://schemas.microsoft.com/office/drawing/2017/model3d" xmlns:o="urn:schemas-microsoft-com:office:office" xmlns:oel="http://schemas.microsoft.com/office/2019/extlst" xmlns:r="http://schemas.openxmlformats.org/officeDocument/2006/relationships" xmlns:m="http://schemas.openxmlformats.org/officeDocument/2006/math" xmlns:v="urn:schemas-microsoft-com:vml" xmlns:wp14="http://schemas.microsoft.com/office/word/2010/wordprocessingDrawing" xmlns:wp="http://schemas.openxmlformats.org/drawingml/2006/wordprocessingDrawing" xmlns:w10="urn:schemas-microsoft-com:office:word" xmlns:w="http://schemas.openxmlformats.org/wordprocessingml/2006/main" xmlns:w14="http://schemas.microsoft.com/office/word/2010/wordml" xmlns:w15="http://schemas.microsoft.com/office/word/2012/wordml" xmlns:w16cex="http://schemas.microsoft.com/office/word/2018/wordml/cex" xmlns:w16cid="http://schemas.microsoft.com/office/word/2016/wordml/cid" xmlns:w16="http://schemas.microsoft.com/office/word/2018/wordml" xmlns:w16sdtdh="http://schemas.microsoft.com/office/word/2020/wordml/sdtdatahash" xmlns:w16se="http://schemas.microsoft.com/office/word/2015/wordml/symex" xmlns:wpg="http://schemas.microsoft.com/office/word/2010/wordprocessingGroup" xmlns:wpi="http://schemas.microsoft.com/office/word/2010/wordprocessingInk" xmlns:wne="http://schemas.microsoft.com/office/word/2006/wordml" xmlns:wps="http://schemas.microsoft.com/office/word/2010/wordprocessingShape" mc:Ignorable="w14 w15 w16se w16cid w16 w16cex w16sdtdh wp14">
   <w:footnote w:type="separator" w:id="-1">
@@ -12516,6 +12824,104 @@
     </w:p>
   </w:footnote>
 </w:footnotes>
+</file>
+
+<file path=word/header1.xml><?xml version="1.0" encoding="utf-8"?>
+<w:hdr xmlns:wpc="http://schemas.microsoft.com/office/word/2010/wordprocessingCanvas" xmlns:cx="http://schemas.microsoft.com/office/drawing/2014/chartex" xmlns:cx1="http://schemas.microsoft.com/office/drawing/2015/9/8/chartex" xmlns:cx2="http://schemas.microsoft.com/office/drawing/2015/10/21/chartex" xmlns:cx3="http://schemas.microsoft.com/office/drawing/2016/5/9/chartex" xmlns:cx4="http://schemas.microsoft.com/office/drawing/2016/5/10/chartex" xmlns:cx5="http://schemas.microsoft.com/office/drawing/2016/5/11/chartex" xmlns:cx6="http://schemas.microsoft.com/office/drawing/2016/5/12/chartex" xmlns:cx7="http://schemas.microsoft.com/office/drawing/2016/5/13/chartex" xmlns:cx8="http://schemas.microsoft.com/office/drawing/2016/5/14/chartex" xmlns:mc="http://schemas.openxmlformats.org/markup-compatibility/2006" xmlns:aink="http://schemas.microsoft.com/office/drawing/2016/ink" xmlns:am3d="http://schemas.microsoft.com/office/drawing/2017/model3d" xmlns:o="urn:schemas-microsoft-com:office:office" xmlns:oel="http://schemas.microsoft.com/office/2019/extlst" xmlns:r="http://schemas.openxmlformats.org/officeDocument/2006/relationships" xmlns:m="http://schemas.openxmlformats.org/officeDocument/2006/math" xmlns:v="urn:schemas-microsoft-com:vml" xmlns:wp14="http://schemas.microsoft.com/office/word/2010/wordprocessingDrawing" xmlns:wp="http://schemas.openxmlformats.org/drawingml/2006/wordprocessingDrawing" xmlns:w10="urn:schemas-microsoft-com:office:word" xmlns:w="http://schemas.openxmlformats.org/wordprocessingml/2006/main" xmlns:w14="http://schemas.microsoft.com/office/word/2010/wordml" xmlns:w15="http://schemas.microsoft.com/office/word/2012/wordml" xmlns:w16cex="http://schemas.microsoft.com/office/word/2018/wordml/cex" xmlns:w16cid="http://schemas.microsoft.com/office/word/2016/wordml/cid" xmlns:w16="http://schemas.microsoft.com/office/word/2018/wordml" xmlns:w16sdtdh="http://schemas.microsoft.com/office/word/2020/wordml/sdtdatahash" xmlns:w16se="http://schemas.microsoft.com/office/word/2015/wordml/symex" xmlns:wpg="http://schemas.microsoft.com/office/word/2010/wordprocessingGroup" xmlns:wpi="http://schemas.microsoft.com/office/word/2010/wordprocessingInk" xmlns:wne="http://schemas.microsoft.com/office/word/2006/wordml" xmlns:wps="http://schemas.microsoft.com/office/word/2010/wordprocessingShape" mc:Ignorable="w14 w15 w16se w16cid w16 w16cex w16sdtdh wp14">
+  <w:p>
+    <w:pPr>
+      <w:pStyle w:val="Encabezado"/>
+    </w:pPr>
+  </w:p>
+</w:hdr>
+</file>
+
+<file path=word/header2.xml><?xml version="1.0" encoding="utf-8"?>
+<w:hdr xmlns:wpc="http://schemas.microsoft.com/office/word/2010/wordprocessingCanvas" xmlns:cx="http://schemas.microsoft.com/office/drawing/2014/chartex" xmlns:cx1="http://schemas.microsoft.com/office/drawing/2015/9/8/chartex" xmlns:cx2="http://schemas.microsoft.com/office/drawing/2015/10/21/chartex" xmlns:cx3="http://schemas.microsoft.com/office/drawing/2016/5/9/chartex" xmlns:cx4="http://schemas.microsoft.com/office/drawing/2016/5/10/chartex" xmlns:cx5="http://schemas.microsoft.com/office/drawing/2016/5/11/chartex" xmlns:cx6="http://schemas.microsoft.com/office/drawing/2016/5/12/chartex" xmlns:cx7="http://schemas.microsoft.com/office/drawing/2016/5/13/chartex" xmlns:cx8="http://schemas.microsoft.com/office/drawing/2016/5/14/chartex" xmlns:mc="http://schemas.openxmlformats.org/markup-compatibility/2006" xmlns:aink="http://schemas.microsoft.com/office/drawing/2016/ink" xmlns:am3d="http://schemas.microsoft.com/office/drawing/2017/model3d" xmlns:o="urn:schemas-microsoft-com:office:office" xmlns:oel="http://schemas.microsoft.com/office/2019/extlst" xmlns:r="http://schemas.openxmlformats.org/officeDocument/2006/relationships" xmlns:m="http://schemas.openxmlformats.org/officeDocument/2006/math" xmlns:v="urn:schemas-microsoft-com:vml" xmlns:wp14="http://schemas.microsoft.com/office/word/2010/wordprocessingDrawing" xmlns:wp="http://schemas.openxmlformats.org/drawingml/2006/wordprocessingDrawing" xmlns:w10="urn:schemas-microsoft-com:office:word" xmlns:w="http://schemas.openxmlformats.org/wordprocessingml/2006/main" xmlns:w14="http://schemas.microsoft.com/office/word/2010/wordml" xmlns:w15="http://schemas.microsoft.com/office/word/2012/wordml" xmlns:w16cex="http://schemas.microsoft.com/office/word/2018/wordml/cex" xmlns:w16cid="http://schemas.microsoft.com/office/word/2016/wordml/cid" xmlns:w16="http://schemas.microsoft.com/office/word/2018/wordml" xmlns:w16sdtdh="http://schemas.microsoft.com/office/word/2020/wordml/sdtdatahash" xmlns:w16se="http://schemas.microsoft.com/office/word/2015/wordml/symex" xmlns:wpg="http://schemas.microsoft.com/office/word/2010/wordprocessingGroup" xmlns:wpi="http://schemas.microsoft.com/office/word/2010/wordprocessingInk" xmlns:wne="http://schemas.microsoft.com/office/word/2006/wordml" xmlns:wps="http://schemas.microsoft.com/office/word/2010/wordprocessingShape" mc:Ignorable="w14 w15 w16se w16cid w16 w16cex w16sdtdh wp14">
+  <w:p>
+    <w:pPr>
+      <w:pStyle w:val="Encabezado"/>
+    </w:pPr>
+  </w:p>
+</w:hdr>
+</file>
+
+<file path=word/header3.xml><?xml version="1.0" encoding="utf-8"?>
+<w:hdr xmlns:wpc="http://schemas.microsoft.com/office/word/2010/wordprocessingCanvas" xmlns:cx="http://schemas.microsoft.com/office/drawing/2014/chartex" xmlns:cx1="http://schemas.microsoft.com/office/drawing/2015/9/8/chartex" xmlns:cx2="http://schemas.microsoft.com/office/drawing/2015/10/21/chartex" xmlns:cx3="http://schemas.microsoft.com/office/drawing/2016/5/9/chartex" xmlns:cx4="http://schemas.microsoft.com/office/drawing/2016/5/10/chartex" xmlns:cx5="http://schemas.microsoft.com/office/drawing/2016/5/11/chartex" xmlns:cx6="http://schemas.microsoft.com/office/drawing/2016/5/12/chartex" xmlns:cx7="http://schemas.microsoft.com/office/drawing/2016/5/13/chartex" xmlns:cx8="http://schemas.microsoft.com/office/drawing/2016/5/14/chartex" xmlns:mc="http://schemas.openxmlformats.org/markup-compatibility/2006" xmlns:aink="http://schemas.microsoft.com/office/drawing/2016/ink" xmlns:am3d="http://schemas.microsoft.com/office/drawing/2017/model3d" xmlns:o="urn:schemas-microsoft-com:office:office" xmlns:oel="http://schemas.microsoft.com/office/2019/extlst" xmlns:r="http://schemas.openxmlformats.org/officeDocument/2006/relationships" xmlns:m="http://schemas.openxmlformats.org/officeDocument/2006/math" xmlns:v="urn:schemas-microsoft-com:vml" xmlns:wp14="http://schemas.microsoft.com/office/word/2010/wordprocessingDrawing" xmlns:wp="http://schemas.openxmlformats.org/drawingml/2006/wordprocessingDrawing" xmlns:w10="urn:schemas-microsoft-com:office:word" xmlns:w="http://schemas.openxmlformats.org/wordprocessingml/2006/main" xmlns:w14="http://schemas.microsoft.com/office/word/2010/wordml" xmlns:w15="http://schemas.microsoft.com/office/word/2012/wordml" xmlns:w16cex="http://schemas.microsoft.com/office/word/2018/wordml/cex" xmlns:w16cid="http://schemas.microsoft.com/office/word/2016/wordml/cid" xmlns:w16="http://schemas.microsoft.com/office/word/2018/wordml" xmlns:w16sdtdh="http://schemas.microsoft.com/office/word/2020/wordml/sdtdatahash" xmlns:w16se="http://schemas.microsoft.com/office/word/2015/wordml/symex" xmlns:wpg="http://schemas.microsoft.com/office/word/2010/wordprocessingGroup" xmlns:wpi="http://schemas.microsoft.com/office/word/2010/wordprocessingInk" xmlns:wne="http://schemas.microsoft.com/office/word/2006/wordml" xmlns:wps="http://schemas.microsoft.com/office/word/2010/wordprocessingShape" mc:Ignorable="w14 w15 w16se w16cid w16 w16cex w16sdtdh wp14">
+  <w:p>
+    <w:pPr>
+      <w:pStyle w:val="Encabezado"/>
+    </w:pPr>
+  </w:p>
+</w:hdr>
+</file>
+
+<file path=word/header4.xml><?xml version="1.0" encoding="utf-8"?>
+<w:hdr xmlns:wpc="http://schemas.microsoft.com/office/word/2010/wordprocessingCanvas" xmlns:cx="http://schemas.microsoft.com/office/drawing/2014/chartex" xmlns:cx1="http://schemas.microsoft.com/office/drawing/2015/9/8/chartex" xmlns:cx2="http://schemas.microsoft.com/office/drawing/2015/10/21/chartex" xmlns:cx3="http://schemas.microsoft.com/office/drawing/2016/5/9/chartex" xmlns:cx4="http://schemas.microsoft.com/office/drawing/2016/5/10/chartex" xmlns:cx5="http://schemas.microsoft.com/office/drawing/2016/5/11/chartex" xmlns:cx6="http://schemas.microsoft.com/office/drawing/2016/5/12/chartex" xmlns:cx7="http://schemas.microsoft.com/office/drawing/2016/5/13/chartex" xmlns:cx8="http://schemas.microsoft.com/office/drawing/2016/5/14/chartex" xmlns:mc="http://schemas.openxmlformats.org/markup-compatibility/2006" xmlns:aink="http://schemas.microsoft.com/office/drawing/2016/ink" xmlns:am3d="http://schemas.microsoft.com/office/drawing/2017/model3d" xmlns:o="urn:schemas-microsoft-com:office:office" xmlns:oel="http://schemas.microsoft.com/office/2019/extlst" xmlns:r="http://schemas.openxmlformats.org/officeDocument/2006/relationships" xmlns:m="http://schemas.openxmlformats.org/officeDocument/2006/math" xmlns:v="urn:schemas-microsoft-com:vml" xmlns:wp14="http://schemas.microsoft.com/office/word/2010/wordprocessingDrawing" xmlns:wp="http://schemas.openxmlformats.org/drawingml/2006/wordprocessingDrawing" xmlns:w10="urn:schemas-microsoft-com:office:word" xmlns:w="http://schemas.openxmlformats.org/wordprocessingml/2006/main" xmlns:w14="http://schemas.microsoft.com/office/word/2010/wordml" xmlns:w15="http://schemas.microsoft.com/office/word/2012/wordml" xmlns:w16cex="http://schemas.microsoft.com/office/word/2018/wordml/cex" xmlns:w16cid="http://schemas.microsoft.com/office/word/2016/wordml/cid" xmlns:w16="http://schemas.microsoft.com/office/word/2018/wordml" xmlns:w16sdtdh="http://schemas.microsoft.com/office/word/2020/wordml/sdtdatahash" xmlns:w16se="http://schemas.microsoft.com/office/word/2015/wordml/symex" xmlns:wpg="http://schemas.microsoft.com/office/word/2010/wordprocessingGroup" xmlns:wpi="http://schemas.microsoft.com/office/word/2010/wordprocessingInk" xmlns:wne="http://schemas.microsoft.com/office/word/2006/wordml" xmlns:wps="http://schemas.microsoft.com/office/word/2010/wordprocessingShape" mc:Ignorable="w14 w15 w16se w16cid w16 w16cex w16sdtdh wp14">
+  <w:sdt>
+    <w:sdtPr>
+      <w:id w:val="-783341367"/>
+      <w:docPartObj>
+        <w:docPartGallery w:val="Page Numbers (Top of Page)"/>
+        <w:docPartUnique/>
+      </w:docPartObj>
+    </w:sdtPr>
+    <w:sdtContent>
+      <w:p>
+        <w:pPr>
+          <w:pStyle w:val="Encabezado"/>
+          <w:jc w:val="right"/>
+        </w:pPr>
+        <w:r>
+          <w:rPr>
+            <w:rFonts w:ascii="Arial" w:hAnsi="Arial" w:cs="Arial"/>
+            <w:sz w:val="24"/>
+            <w:szCs w:val="24"/>
+          </w:rPr>
+          <w:fldChar w:fldCharType="begin"/>
+        </w:r>
+        <w:r>
+          <w:rPr>
+            <w:rFonts w:ascii="Arial" w:hAnsi="Arial" w:cs="Arial"/>
+            <w:sz w:val="24"/>
+            <w:szCs w:val="24"/>
+          </w:rPr>
+          <w:instrText>PAGE   \* MERGEFORMAT</w:instrText>
+        </w:r>
+        <w:r>
+          <w:rPr>
+            <w:rFonts w:ascii="Arial" w:hAnsi="Arial" w:cs="Arial"/>
+            <w:sz w:val="24"/>
+            <w:szCs w:val="24"/>
+          </w:rPr>
+          <w:fldChar w:fldCharType="separate"/>
+        </w:r>
+        <w:r>
+          <w:rPr>
+            <w:rFonts w:ascii="Arial" w:hAnsi="Arial" w:cs="Arial"/>
+            <w:sz w:val="24"/>
+            <w:szCs w:val="24"/>
+            <w:lang w:val="es-ES"/>
+          </w:rPr>
+          <w:t>2</w:t>
+        </w:r>
+        <w:r>
+          <w:rPr>
+            <w:rFonts w:ascii="Arial" w:hAnsi="Arial" w:cs="Arial"/>
+            <w:sz w:val="24"/>
+            <w:szCs w:val="24"/>
+          </w:rPr>
+          <w:fldChar w:fldCharType="end"/>
+        </w:r>
+      </w:p>
+    </w:sdtContent>
+  </w:sdt>
+  <w:p>
+    <w:pPr>
+      <w:pStyle w:val="Encabezado"/>
+    </w:pPr>
+  </w:p>
+</w:hdr>
 </file>
 
 <file path=word/numbering.xml><?xml version="1.0" encoding="utf-8"?>

</xml_diff>